<commit_message>
Ensure compact table keys are unique
Co-authored-by: dreamcheap2000 <229635625+dreamcheap2000@users.noreply.github.com>
</commit_message>
<xml_diff>
--- a/20260912_Tables_1840.docx
+++ b/20260912_Tables_1840.docx
@@ -1227,7 +1227,7 @@
                 <w:color w:val="FFFFFF"/>
                 <w:sz w:val="14"/>
               </w:rPr>
-              <w:t>RESTORE (n=21)</w:t>
+              <w:t>1. RESTORE (n=21)</w:t>
             </w:r>
           </w:p>
         </w:tc>
@@ -1247,7 +1247,7 @@
                 <w:color w:val="FFFFFF"/>
                 <w:sz w:val="14"/>
               </w:rPr>
-              <w:t>COMPASS (n=44)</w:t>
+              <w:t>2. COMPASS (n=44)</w:t>
             </w:r>
           </w:p>
         </w:tc>
@@ -1267,7 +1267,7 @@
                 <w:color w:val="FFFFFF"/>
                 <w:sz w:val="14"/>
               </w:rPr>
-              <w:t>CASCADE (n=59)</w:t>
+              <w:t>3. CASCADE (n=59)</w:t>
             </w:r>
           </w:p>
         </w:tc>
@@ -1287,7 +1287,7 @@
                 <w:color w:val="FFFFFF"/>
                 <w:sz w:val="14"/>
               </w:rPr>
-              <w:t>AIMS (n=12)</w:t>
+              <w:t>4. AIMS (n=12)</w:t>
             </w:r>
           </w:p>
         </w:tc>
@@ -1307,7 +1307,7 @@
                 <w:color w:val="FFFFFF"/>
                 <w:sz w:val="14"/>
               </w:rPr>
-              <w:t>BEDSIDE (n=4)</w:t>
+              <w:t>5. BEDSIDE (n=4)</w:t>
             </w:r>
           </w:p>
         </w:tc>

</xml_diff>

<commit_message>
Refine compact predictor labels
Co-authored-by: dreamcheap2000 <229635625+dreamcheap2000@users.noreply.github.com>
</commit_message>
<xml_diff>
--- a/20260912_Tables_1840.docx
+++ b/20260912_Tables_1840.docx
@@ -1344,7 +1344,7 @@
               <w:rPr>
                 <w:sz w:val="14"/>
               </w:rPr>
-              <w:t>+77.7; 100%</w:t>
+              <w:t>77.7; 100%</w:t>
             </w:r>
           </w:p>
         </w:tc>
@@ -1361,7 +1361,7 @@
               <w:rPr>
                 <w:sz w:val="14"/>
               </w:rPr>
-              <w:t>+62.5; 100%</w:t>
+              <w:t>62.5; 100%</w:t>
             </w:r>
           </w:p>
         </w:tc>
@@ -1378,7 +1378,7 @@
               <w:rPr>
                 <w:sz w:val="14"/>
               </w:rPr>
-              <w:t>+63.9; 100%</w:t>
+              <w:t>63.9; 100%</w:t>
             </w:r>
           </w:p>
         </w:tc>
@@ -1395,7 +1395,7 @@
               <w:rPr>
                 <w:sz w:val="14"/>
               </w:rPr>
-              <w:t>+61.2; 100%</w:t>
+              <w:t>61.2; 100%</w:t>
             </w:r>
           </w:p>
         </w:tc>
@@ -1412,7 +1412,7 @@
               <w:rPr>
                 <w:sz w:val="14"/>
               </w:rPr>
-              <w:t>+68.6; 100%</w:t>
+              <w:t>68.6; 100%</w:t>
             </w:r>
           </w:p>
         </w:tc>
@@ -1554,7 +1554,7 @@
               <w:rPr>
                 <w:sz w:val="14"/>
               </w:rPr>
-              <w:t>+35.6; 100%</w:t>
+              <w:t>35.6; 100%</w:t>
             </w:r>
           </w:p>
         </w:tc>
@@ -1571,7 +1571,7 @@
               <w:rPr>
                 <w:sz w:val="14"/>
               </w:rPr>
-              <w:t>+30.3; 100%</w:t>
+              <w:t>30.3; 100%</w:t>
             </w:r>
           </w:p>
         </w:tc>
@@ -1588,7 +1588,7 @@
               <w:rPr>
                 <w:sz w:val="14"/>
               </w:rPr>
-              <w:t>+28.5; 100%</w:t>
+              <w:t>28.5; 100%</w:t>
             </w:r>
           </w:p>
         </w:tc>
@@ -1605,7 +1605,7 @@
               <w:rPr>
                 <w:sz w:val="14"/>
               </w:rPr>
-              <w:t>+33.1; 100%</w:t>
+              <w:t>33.1; 100%</w:t>
             </w:r>
           </w:p>
         </w:tc>
@@ -1622,7 +1622,7 @@
               <w:rPr>
                 <w:sz w:val="14"/>
               </w:rPr>
-              <w:t>+38.3; 100%</w:t>
+              <w:t>38.3; 100%</w:t>
             </w:r>
           </w:p>
         </w:tc>
@@ -1659,7 +1659,7 @@
               <w:rPr>
                 <w:sz w:val="14"/>
               </w:rPr>
-              <w:t>+16.9; 100%</w:t>
+              <w:t>16.9; 100%</w:t>
             </w:r>
           </w:p>
         </w:tc>
@@ -1676,7 +1676,7 @@
               <w:rPr>
                 <w:sz w:val="14"/>
               </w:rPr>
-              <w:t>+15.9; 100%</w:t>
+              <w:t>15.9; 100%</w:t>
             </w:r>
           </w:p>
         </w:tc>
@@ -1693,7 +1693,7 @@
               <w:rPr>
                 <w:sz w:val="14"/>
               </w:rPr>
-              <w:t>+15.8; 100%</w:t>
+              <w:t>15.8; 100%</w:t>
             </w:r>
           </w:p>
         </w:tc>
@@ -1710,7 +1710,7 @@
               <w:rPr>
                 <w:sz w:val="14"/>
               </w:rPr>
-              <w:t>+15.5; 100%</w:t>
+              <w:t>15.5; 100%</w:t>
             </w:r>
           </w:p>
         </w:tc>
@@ -1727,7 +1727,7 @@
               <w:rPr>
                 <w:sz w:val="14"/>
               </w:rPr>
-              <w:t>+17.6; 100%</w:t>
+              <w:t>17.6; 100%</w:t>
             </w:r>
           </w:p>
         </w:tc>
@@ -1764,7 +1764,7 @@
               <w:rPr>
                 <w:sz w:val="14"/>
               </w:rPr>
-              <w:t>+27.7; 100%</w:t>
+              <w:t>27.7; 100%</w:t>
             </w:r>
           </w:p>
         </w:tc>
@@ -1781,7 +1781,7 @@
               <w:rPr>
                 <w:sz w:val="14"/>
               </w:rPr>
-              <w:t>+21.3; 100%</w:t>
+              <w:t>21.3; 100%</w:t>
             </w:r>
           </w:p>
         </w:tc>
@@ -1798,7 +1798,7 @@
               <w:rPr>
                 <w:sz w:val="14"/>
               </w:rPr>
-              <w:t>+17.1; 99%</w:t>
+              <w:t>17.1; 99%</w:t>
             </w:r>
           </w:p>
         </w:tc>
@@ -1815,7 +1815,7 @@
               <w:rPr>
                 <w:sz w:val="14"/>
               </w:rPr>
-              <w:t>+23.7; 100%</w:t>
+              <w:t>23.7; 100%</w:t>
             </w:r>
           </w:p>
         </w:tc>
@@ -1869,7 +1869,7 @@
               <w:rPr>
                 <w:sz w:val="14"/>
               </w:rPr>
-              <w:t>+24.2; 100%</w:t>
+              <w:t>24.2; 100%</w:t>
             </w:r>
           </w:p>
         </w:tc>
@@ -1886,7 +1886,7 @@
               <w:rPr>
                 <w:sz w:val="14"/>
               </w:rPr>
-              <w:t>+8.2; 92%</w:t>
+              <w:t>8.2; 92%</w:t>
             </w:r>
           </w:p>
         </w:tc>
@@ -1903,7 +1903,7 @@
               <w:rPr>
                 <w:sz w:val="14"/>
               </w:rPr>
-              <w:t>+8.5; 91%</w:t>
+              <w:t>8.5; 91%</w:t>
             </w:r>
           </w:p>
         </w:tc>
@@ -1920,7 +1920,7 @@
               <w:rPr>
                 <w:sz w:val="14"/>
               </w:rPr>
-              <w:t>+10.7; 95%</w:t>
+              <w:t>10.7; 95%</w:t>
             </w:r>
           </w:p>
         </w:tc>
@@ -2184,7 +2184,7 @@
               <w:rPr>
                 <w:sz w:val="14"/>
               </w:rPr>
-              <w:t>+0.5; 77%</w:t>
+              <w:t>0.5; 77%</w:t>
             </w:r>
           </w:p>
         </w:tc>
@@ -2306,7 +2306,7 @@
               <w:rPr>
                 <w:sz w:val="14"/>
               </w:rPr>
-              <w:t>+13.7; 100%</w:t>
+              <w:t>13.7; 100%</w:t>
             </w:r>
           </w:p>
         </w:tc>
@@ -2323,7 +2323,7 @@
               <w:rPr>
                 <w:sz w:val="14"/>
               </w:rPr>
-              <w:t>+14.8; 100%</w:t>
+              <w:t>14.8; 100%</w:t>
             </w:r>
           </w:p>
         </w:tc>
@@ -2516,7 +2516,7 @@
               <w:rPr>
                 <w:sz w:val="14"/>
               </w:rPr>
-              <w:t>+9.6; 96%</w:t>
+              <w:t>9.6; 96%</w:t>
             </w:r>
           </w:p>
         </w:tc>
@@ -2533,7 +2533,7 @@
               <w:rPr>
                 <w:sz w:val="14"/>
               </w:rPr>
-              <w:t>+9.1; 96%</w:t>
+              <w:t>9.1; 96%</w:t>
             </w:r>
           </w:p>
         </w:tc>
@@ -2936,7 +2936,7 @@
               <w:rPr>
                 <w:sz w:val="14"/>
               </w:rPr>
-              <w:t>+6.9; 87%</w:t>
+              <w:t>6.9; 87%</w:t>
             </w:r>
           </w:p>
         </w:tc>
@@ -2953,7 +2953,7 @@
               <w:rPr>
                 <w:sz w:val="14"/>
               </w:rPr>
-              <w:t>+8.2; 91%</w:t>
+              <w:t>8.2; 91%</w:t>
             </w:r>
           </w:p>
         </w:tc>
@@ -3041,7 +3041,7 @@
               <w:rPr>
                 <w:sz w:val="14"/>
               </w:rPr>
-              <w:t>+10.2; 89%</w:t>
+              <w:t>10.2; 89%</w:t>
             </w:r>
           </w:p>
         </w:tc>
@@ -3058,7 +3058,7 @@
               <w:rPr>
                 <w:sz w:val="14"/>
               </w:rPr>
-              <w:t>+11.2; 87%</w:t>
+              <w:t>11.2; 87%</w:t>
             </w:r>
           </w:p>
         </w:tc>
@@ -3251,7 +3251,7 @@
               <w:rPr>
                 <w:sz w:val="14"/>
               </w:rPr>
-              <w:t>+7.2; 87%</w:t>
+              <w:t>7.2; 87%</w:t>
             </w:r>
           </w:p>
         </w:tc>
@@ -3268,7 +3268,7 @@
               <w:rPr>
                 <w:sz w:val="14"/>
               </w:rPr>
-              <w:t>+5.3; 80%</w:t>
+              <w:t>5.3; 80%</w:t>
             </w:r>
           </w:p>
         </w:tc>
@@ -3461,7 +3461,7 @@
               <w:rPr>
                 <w:sz w:val="14"/>
               </w:rPr>
-              <w:t>+5.6; 84%</w:t>
+              <w:t>5.6; 84%</w:t>
             </w:r>
           </w:p>
         </w:tc>
@@ -3478,7 +3478,7 @@
               <w:rPr>
                 <w:sz w:val="14"/>
               </w:rPr>
-              <w:t>+4.8; 80%</w:t>
+              <w:t>4.8; 80%</w:t>
             </w:r>
           </w:p>
         </w:tc>

</xml_diff>

<commit_message>
Regenerate publication revision outputs
Co-authored-by: dreamcheap2000 <229635625+dreamcheap2000@users.noreply.github.com>
</commit_message>
<xml_diff>
--- a/20260912_Tables_1840.docx
+++ b/20260912_Tables_1840.docx
@@ -22,7 +22,18 @@
         <w:rPr>
           <w:sz w:val="16"/>
         </w:rPr>
-        <w:t>Compact journal tables are shown here; full model-by-model performance metrics and coefficient details are moved to supplementary tables.</w:t>
+        <w:t>Models are presented in clinical deployment order rather than point-estimate rank because the internal balanced-accuracy intervals are broadly overlapping and do not support a definitive superiority claim.</w:t>
+      </w:r>
+    </w:p>
+    <w:p>
+      <w:pPr>
+        <w:jc w:val="center"/>
+      </w:pPr>
+      <w:r>
+        <w:rPr>
+          <w:sz w:val="16"/>
+        </w:rPr>
+        <w:t>BEDSIDE is the primary deployment recommendation and AIMS is the secondary recommendation because both preserve internal performance within about 0.06 weighted OOF R² and 6 m weighted OOF MAE of the larger retained models while using far fewer predictors.</w:t>
       </w:r>
     </w:p>
     <w:p>
@@ -34,7 +45,7 @@
           <w:b/>
           <w:sz w:val="20"/>
         </w:rPr>
-        <w:t>Table 1. Compact performance summary of the 5 retained models</w:t>
+        <w:t>Table 1. Clinically ordered comparison of the 5 retained models</w:t>
       </w:r>
     </w:p>
     <w:p>
@@ -45,7 +56,7 @@
         <w:rPr>
           <w:sz w:val="16"/>
         </w:rPr>
-        <w:t>R² and MAE are restored here, while sensitivity, specificity, and other detailed operating characteristics are provided in the supplementary tables.</w:t>
+        <w:t>Rows are intentionally ordered by clinical parsimony. Calibration metrics are from weighted out-of-fold predictions among completers; balanced accuracy is still shown for the Best and Worst non-completer walking scenarios.</w:t>
       </w:r>
     </w:p>
     <w:tbl>
@@ -64,21 +75,25 @@
         </w:tblBorders>
       </w:tblPr>
       <w:tblGrid>
-        <w:gridCol w:w="1440"/>
-        <w:gridCol w:w="1440"/>
-        <w:gridCol w:w="1440"/>
-        <w:gridCol w:w="1440"/>
-        <w:gridCol w:w="1440"/>
-        <w:gridCol w:w="1440"/>
-        <w:gridCol w:w="1440"/>
-        <w:gridCol w:w="1440"/>
-        <w:gridCol w:w="1440"/>
-        <w:gridCol w:w="1440"/>
+        <w:gridCol w:w="1029"/>
+        <w:gridCol w:w="1029"/>
+        <w:gridCol w:w="1029"/>
+        <w:gridCol w:w="1029"/>
+        <w:gridCol w:w="1029"/>
+        <w:gridCol w:w="1029"/>
+        <w:gridCol w:w="1029"/>
+        <w:gridCol w:w="1029"/>
+        <w:gridCol w:w="1029"/>
+        <w:gridCol w:w="1029"/>
+        <w:gridCol w:w="1029"/>
+        <w:gridCol w:w="1029"/>
+        <w:gridCol w:w="1029"/>
+        <w:gridCol w:w="1029"/>
       </w:tblGrid>
       <w:tr>
         <w:tc>
           <w:tcPr>
-            <w:tcW w:type="dxa" w:w="1440"/>
+            <w:tcW w:type="dxa" w:w="1029"/>
             <w:shd w:fill="1F4E78"/>
             <w:vAlign w:val="center"/>
           </w:tcPr>
@@ -92,13 +107,13 @@
                 <w:color w:val="FFFFFF"/>
                 <w:sz w:val="14"/>
               </w:rPr>
-              <w:t>Rank</w:t>
+              <w:t>Clinical role</w:t>
             </w:r>
           </w:p>
         </w:tc>
         <w:tc>
           <w:tcPr>
-            <w:tcW w:type="dxa" w:w="1440"/>
+            <w:tcW w:type="dxa" w:w="1029"/>
             <w:shd w:fill="1F4E78"/>
             <w:vAlign w:val="center"/>
           </w:tcPr>
@@ -118,7 +133,7 @@
         </w:tc>
         <w:tc>
           <w:tcPr>
-            <w:tcW w:type="dxa" w:w="1440"/>
+            <w:tcW w:type="dxa" w:w="1029"/>
             <w:shd w:fill="1F4E78"/>
             <w:vAlign w:val="center"/>
           </w:tcPr>
@@ -138,7 +153,7 @@
         </w:tc>
         <w:tc>
           <w:tcPr>
-            <w:tcW w:type="dxa" w:w="1440"/>
+            <w:tcW w:type="dxa" w:w="1029"/>
             <w:shd w:fill="1F4E78"/>
             <w:vAlign w:val="center"/>
           </w:tcPr>
@@ -158,7 +173,7 @@
         </w:tc>
         <w:tc>
           <w:tcPr>
-            <w:tcW w:type="dxa" w:w="1440"/>
+            <w:tcW w:type="dxa" w:w="1029"/>
             <w:shd w:fill="1F4E78"/>
             <w:vAlign w:val="center"/>
           </w:tcPr>
@@ -178,7 +193,7 @@
         </w:tc>
         <w:tc>
           <w:tcPr>
-            <w:tcW w:type="dxa" w:w="1440"/>
+            <w:tcW w:type="dxa" w:w="1029"/>
             <w:shd w:fill="1F4E78"/>
             <w:vAlign w:val="center"/>
           </w:tcPr>
@@ -198,7 +213,7 @@
         </w:tc>
         <w:tc>
           <w:tcPr>
-            <w:tcW w:type="dxa" w:w="1440"/>
+            <w:tcW w:type="dxa" w:w="1029"/>
             <w:shd w:fill="1F4E78"/>
             <w:vAlign w:val="center"/>
           </w:tcPr>
@@ -218,7 +233,7 @@
         </w:tc>
         <w:tc>
           <w:tcPr>
-            <w:tcW w:type="dxa" w:w="1440"/>
+            <w:tcW w:type="dxa" w:w="1029"/>
             <w:shd w:fill="1F4E78"/>
             <w:vAlign w:val="center"/>
           </w:tcPr>
@@ -238,7 +253,87 @@
         </w:tc>
         <w:tc>
           <w:tcPr>
-            <w:tcW w:type="dxa" w:w="1440"/>
+            <w:tcW w:type="dxa" w:w="1029"/>
+            <w:shd w:fill="1F4E78"/>
+            <w:vAlign w:val="center"/>
+          </w:tcPr>
+          <w:p>
+            <w:pPr>
+              <w:jc w:val="center"/>
+            </w:pPr>
+            <w:r>
+              <w:rPr>
+                <w:b/>
+                <w:color w:val="FFFFFF"/>
+                <w:sz w:val="14"/>
+              </w:rPr>
+              <w:t>Δ vs RESTORE R²</w:t>
+            </w:r>
+          </w:p>
+        </w:tc>
+        <w:tc>
+          <w:tcPr>
+            <w:tcW w:type="dxa" w:w="1029"/>
+            <w:shd w:fill="1F4E78"/>
+            <w:vAlign w:val="center"/>
+          </w:tcPr>
+          <w:p>
+            <w:pPr>
+              <w:jc w:val="center"/>
+            </w:pPr>
+            <w:r>
+              <w:rPr>
+                <w:b/>
+                <w:color w:val="FFFFFF"/>
+                <w:sz w:val="14"/>
+              </w:rPr>
+              <w:t>Δ vs RESTORE MAE (m)</w:t>
+            </w:r>
+          </w:p>
+        </w:tc>
+        <w:tc>
+          <w:tcPr>
+            <w:tcW w:type="dxa" w:w="1029"/>
+            <w:shd w:fill="1F4E78"/>
+            <w:vAlign w:val="center"/>
+          </w:tcPr>
+          <w:p>
+            <w:pPr>
+              <w:jc w:val="center"/>
+            </w:pPr>
+            <w:r>
+              <w:rPr>
+                <w:b/>
+                <w:color w:val="FFFFFF"/>
+                <w:sz w:val="14"/>
+              </w:rPr>
+              <w:t>Calibration intercept (m)</w:t>
+            </w:r>
+          </w:p>
+        </w:tc>
+        <w:tc>
+          <w:tcPr>
+            <w:tcW w:type="dxa" w:w="1029"/>
+            <w:shd w:fill="1F4E78"/>
+            <w:vAlign w:val="center"/>
+          </w:tcPr>
+          <w:p>
+            <w:pPr>
+              <w:jc w:val="center"/>
+            </w:pPr>
+            <w:r>
+              <w:rPr>
+                <w:b/>
+                <w:color w:val="FFFFFF"/>
+                <w:sz w:val="14"/>
+              </w:rPr>
+              <w:t>Calibration slope</w:t>
+            </w:r>
+          </w:p>
+        </w:tc>
+        <w:tc>
+          <w:tcPr>
+            <w:tcW w:type="dxa" w:w="1029"/>
             <w:shd w:fill="1F4E78"/>
             <w:vAlign w:val="center"/>
           </w:tcPr>
@@ -258,7 +353,7 @@
         </w:tc>
         <w:tc>
           <w:tcPr>
-            <w:tcW w:type="dxa" w:w="1440"/>
+            <w:tcW w:type="dxa" w:w="1029"/>
             <w:shd w:fill="1F4E78"/>
             <w:vAlign w:val="center"/>
           </w:tcPr>
@@ -280,7 +375,7 @@
       <w:tr>
         <w:tc>
           <w:tcPr>
-            <w:tcW w:type="dxa" w:w="1440"/>
+            <w:tcW w:type="dxa" w:w="1029"/>
             <w:shd w:fill="EAF2F8"/>
             <w:vAlign w:val="center"/>
           </w:tcPr>
@@ -292,13 +387,495 @@
               <w:rPr>
                 <w:sz w:val="14"/>
               </w:rPr>
-              <w:t>1</w:t>
+              <w:t>Primary recommendation</w:t>
             </w:r>
           </w:p>
         </w:tc>
         <w:tc>
           <w:tcPr>
-            <w:tcW w:type="dxa" w:w="1440"/>
+            <w:tcW w:type="dxa" w:w="1029"/>
+            <w:vAlign w:val="center"/>
+          </w:tcPr>
+          <w:p>
+            <w:pPr>
+              <w:jc w:val="center"/>
+            </w:pPr>
+            <w:r>
+              <w:rPr>
+                <w:sz w:val="14"/>
+              </w:rPr>
+              <w:t>BEDSIDE</w:t>
+            </w:r>
+          </w:p>
+        </w:tc>
+        <w:tc>
+          <w:tcPr>
+            <w:tcW w:type="dxa" w:w="1029"/>
+            <w:vAlign w:val="center"/>
+          </w:tcPr>
+          <w:p>
+            <w:pPr>
+              <w:jc w:val="center"/>
+            </w:pPr>
+            <w:r>
+              <w:rPr>
+                <w:sz w:val="14"/>
+              </w:rPr>
+              <w:t>Balance-Enhanced Demographic Speed Index for Discharge Endurance</w:t>
+            </w:r>
+          </w:p>
+        </w:tc>
+        <w:tc>
+          <w:tcPr>
+            <w:tcW w:type="dxa" w:w="1029"/>
+            <w:vAlign w:val="center"/>
+          </w:tcPr>
+          <w:p>
+            <w:pPr>
+              <w:jc w:val="center"/>
+            </w:pPr>
+            <w:r>
+              <w:rPr>
+                <w:sz w:val="14"/>
+              </w:rPr>
+              <w:t>4</w:t>
+            </w:r>
+          </w:p>
+        </w:tc>
+        <w:tc>
+          <w:tcPr>
+            <w:tcW w:type="dxa" w:w="1029"/>
+            <w:vAlign w:val="center"/>
+          </w:tcPr>
+          <w:p>
+            <w:pPr>
+              <w:jc w:val="center"/>
+            </w:pPr>
+            <w:r>
+              <w:rPr>
+                <w:sz w:val="14"/>
+              </w:rPr>
+              <w:t>0.4836</w:t>
+            </w:r>
+          </w:p>
+        </w:tc>
+        <w:tc>
+          <w:tcPr>
+            <w:tcW w:type="dxa" w:w="1029"/>
+            <w:vAlign w:val="center"/>
+          </w:tcPr>
+          <w:p>
+            <w:pPr>
+              <w:jc w:val="center"/>
+            </w:pPr>
+            <w:r>
+              <w:rPr>
+                <w:sz w:val="14"/>
+              </w:rPr>
+              <w:t>95.35</w:t>
+            </w:r>
+          </w:p>
+        </w:tc>
+        <w:tc>
+          <w:tcPr>
+            <w:tcW w:type="dxa" w:w="1029"/>
+            <w:vAlign w:val="center"/>
+          </w:tcPr>
+          <w:p>
+            <w:pPr>
+              <w:jc w:val="center"/>
+            </w:pPr>
+            <w:r>
+              <w:rPr>
+                <w:sz w:val="14"/>
+              </w:rPr>
+              <w:t>0.4906</w:t>
+            </w:r>
+          </w:p>
+        </w:tc>
+        <w:tc>
+          <w:tcPr>
+            <w:tcW w:type="dxa" w:w="1029"/>
+            <w:vAlign w:val="center"/>
+          </w:tcPr>
+          <w:p>
+            <w:pPr>
+              <w:jc w:val="center"/>
+            </w:pPr>
+            <w:r>
+              <w:rPr>
+                <w:sz w:val="14"/>
+              </w:rPr>
+              <w:t>95.0</w:t>
+            </w:r>
+          </w:p>
+        </w:tc>
+        <w:tc>
+          <w:tcPr>
+            <w:tcW w:type="dxa" w:w="1029"/>
+            <w:vAlign w:val="center"/>
+          </w:tcPr>
+          <w:p>
+            <w:pPr>
+              <w:jc w:val="center"/>
+            </w:pPr>
+            <w:r>
+              <w:rPr>
+                <w:sz w:val="14"/>
+              </w:rPr>
+              <w:t>-0.0551</w:t>
+            </w:r>
+          </w:p>
+        </w:tc>
+        <w:tc>
+          <w:tcPr>
+            <w:tcW w:type="dxa" w:w="1029"/>
+            <w:vAlign w:val="center"/>
+          </w:tcPr>
+          <w:p>
+            <w:pPr>
+              <w:jc w:val="center"/>
+            </w:pPr>
+            <w:r>
+              <w:rPr>
+                <w:sz w:val="14"/>
+              </w:rPr>
+              <w:t>+5.7</w:t>
+            </w:r>
+          </w:p>
+        </w:tc>
+        <w:tc>
+          <w:tcPr>
+            <w:tcW w:type="dxa" w:w="1029"/>
+            <w:vAlign w:val="center"/>
+          </w:tcPr>
+          <w:p>
+            <w:pPr>
+              <w:jc w:val="center"/>
+            </w:pPr>
+            <w:r>
+              <w:rPr>
+                <w:sz w:val="14"/>
+              </w:rPr>
+              <w:t>1.2</w:t>
+            </w:r>
+          </w:p>
+        </w:tc>
+        <w:tc>
+          <w:tcPr>
+            <w:tcW w:type="dxa" w:w="1029"/>
+            <w:vAlign w:val="center"/>
+          </w:tcPr>
+          <w:p>
+            <w:pPr>
+              <w:jc w:val="center"/>
+            </w:pPr>
+            <w:r>
+              <w:rPr>
+                <w:sz w:val="14"/>
+              </w:rPr>
+              <w:t>0.997</w:t>
+            </w:r>
+          </w:p>
+        </w:tc>
+        <w:tc>
+          <w:tcPr>
+            <w:tcW w:type="dxa" w:w="1029"/>
+            <w:vAlign w:val="center"/>
+          </w:tcPr>
+          <w:p>
+            <w:pPr>
+              <w:jc w:val="center"/>
+            </w:pPr>
+            <w:r>
+              <w:rPr>
+                <w:sz w:val="14"/>
+              </w:rPr>
+              <w:t>82.0% [77.8, 86.8]</w:t>
+            </w:r>
+          </w:p>
+        </w:tc>
+        <w:tc>
+          <w:tcPr>
+            <w:tcW w:type="dxa" w:w="1029"/>
+            <w:vAlign w:val="center"/>
+          </w:tcPr>
+          <w:p>
+            <w:pPr>
+              <w:jc w:val="center"/>
+            </w:pPr>
+            <w:r>
+              <w:rPr>
+                <w:sz w:val="14"/>
+              </w:rPr>
+              <w:t>83.0% [79.6, 87.1]</w:t>
+            </w:r>
+          </w:p>
+        </w:tc>
+      </w:tr>
+      <w:tr>
+        <w:tc>
+          <w:tcPr>
+            <w:tcW w:type="dxa" w:w="1029"/>
+            <w:shd w:fill="EAF2F8"/>
+            <w:vAlign w:val="center"/>
+          </w:tcPr>
+          <w:p>
+            <w:pPr>
+              <w:jc w:val="left"/>
+            </w:pPr>
+            <w:r>
+              <w:rPr>
+                <w:sz w:val="14"/>
+              </w:rPr>
+              <w:t>Secondary recommendation</w:t>
+            </w:r>
+          </w:p>
+        </w:tc>
+        <w:tc>
+          <w:tcPr>
+            <w:tcW w:type="dxa" w:w="1029"/>
+            <w:vAlign w:val="center"/>
+          </w:tcPr>
+          <w:p>
+            <w:pPr>
+              <w:jc w:val="center"/>
+            </w:pPr>
+            <w:r>
+              <w:rPr>
+                <w:sz w:val="14"/>
+              </w:rPr>
+              <w:t>AIMS</w:t>
+            </w:r>
+          </w:p>
+        </w:tc>
+        <w:tc>
+          <w:tcPr>
+            <w:tcW w:type="dxa" w:w="1029"/>
+            <w:vAlign w:val="center"/>
+          </w:tcPr>
+          <w:p>
+            <w:pPr>
+              <w:jc w:val="center"/>
+            </w:pPr>
+            <w:r>
+              <w:rPr>
+                <w:sz w:val="14"/>
+              </w:rPr>
+              <w:t>Admission Impairment Mobility Score</w:t>
+            </w:r>
+          </w:p>
+        </w:tc>
+        <w:tc>
+          <w:tcPr>
+            <w:tcW w:type="dxa" w:w="1029"/>
+            <w:vAlign w:val="center"/>
+          </w:tcPr>
+          <w:p>
+            <w:pPr>
+              <w:jc w:val="center"/>
+            </w:pPr>
+            <w:r>
+              <w:rPr>
+                <w:sz w:val="14"/>
+              </w:rPr>
+              <w:t>12</w:t>
+            </w:r>
+          </w:p>
+        </w:tc>
+        <w:tc>
+          <w:tcPr>
+            <w:tcW w:type="dxa" w:w="1029"/>
+            <w:vAlign w:val="center"/>
+          </w:tcPr>
+          <w:p>
+            <w:pPr>
+              <w:jc w:val="center"/>
+            </w:pPr>
+            <w:r>
+              <w:rPr>
+                <w:sz w:val="14"/>
+              </w:rPr>
+              <w:t>0.4906</w:t>
+            </w:r>
+          </w:p>
+        </w:tc>
+        <w:tc>
+          <w:tcPr>
+            <w:tcW w:type="dxa" w:w="1029"/>
+            <w:vAlign w:val="center"/>
+          </w:tcPr>
+          <w:p>
+            <w:pPr>
+              <w:jc w:val="center"/>
+            </w:pPr>
+            <w:r>
+              <w:rPr>
+                <w:sz w:val="14"/>
+              </w:rPr>
+              <w:t>95.07</w:t>
+            </w:r>
+          </w:p>
+        </w:tc>
+        <w:tc>
+          <w:tcPr>
+            <w:tcW w:type="dxa" w:w="1029"/>
+            <w:vAlign w:val="center"/>
+          </w:tcPr>
+          <w:p>
+            <w:pPr>
+              <w:jc w:val="center"/>
+            </w:pPr>
+            <w:r>
+              <w:rPr>
+                <w:sz w:val="14"/>
+              </w:rPr>
+              <w:t>0.4922</w:t>
+            </w:r>
+          </w:p>
+        </w:tc>
+        <w:tc>
+          <w:tcPr>
+            <w:tcW w:type="dxa" w:w="1029"/>
+            <w:vAlign w:val="center"/>
+          </w:tcPr>
+          <w:p>
+            <w:pPr>
+              <w:jc w:val="center"/>
+            </w:pPr>
+            <w:r>
+              <w:rPr>
+                <w:sz w:val="14"/>
+              </w:rPr>
+              <w:t>94.6</w:t>
+            </w:r>
+          </w:p>
+        </w:tc>
+        <w:tc>
+          <w:tcPr>
+            <w:tcW w:type="dxa" w:w="1029"/>
+            <w:vAlign w:val="center"/>
+          </w:tcPr>
+          <w:p>
+            <w:pPr>
+              <w:jc w:val="center"/>
+            </w:pPr>
+            <w:r>
+              <w:rPr>
+                <w:sz w:val="14"/>
+              </w:rPr>
+              <w:t>-0.0535</w:t>
+            </w:r>
+          </w:p>
+        </w:tc>
+        <w:tc>
+          <w:tcPr>
+            <w:tcW w:type="dxa" w:w="1029"/>
+            <w:vAlign w:val="center"/>
+          </w:tcPr>
+          <w:p>
+            <w:pPr>
+              <w:jc w:val="center"/>
+            </w:pPr>
+            <w:r>
+              <w:rPr>
+                <w:sz w:val="14"/>
+              </w:rPr>
+              <w:t>+5.3</w:t>
+            </w:r>
+          </w:p>
+        </w:tc>
+        <w:tc>
+          <w:tcPr>
+            <w:tcW w:type="dxa" w:w="1029"/>
+            <w:vAlign w:val="center"/>
+          </w:tcPr>
+          <w:p>
+            <w:pPr>
+              <w:jc w:val="center"/>
+            </w:pPr>
+            <w:r>
+              <w:rPr>
+                <w:sz w:val="14"/>
+              </w:rPr>
+              <w:t>9.3</w:t>
+            </w:r>
+          </w:p>
+        </w:tc>
+        <w:tc>
+          <w:tcPr>
+            <w:tcW w:type="dxa" w:w="1029"/>
+            <w:vAlign w:val="center"/>
+          </w:tcPr>
+          <w:p>
+            <w:pPr>
+              <w:jc w:val="center"/>
+            </w:pPr>
+            <w:r>
+              <w:rPr>
+                <w:sz w:val="14"/>
+              </w:rPr>
+              <w:t>0.972</w:t>
+            </w:r>
+          </w:p>
+        </w:tc>
+        <w:tc>
+          <w:tcPr>
+            <w:tcW w:type="dxa" w:w="1029"/>
+            <w:vAlign w:val="center"/>
+          </w:tcPr>
+          <w:p>
+            <w:pPr>
+              <w:jc w:val="center"/>
+            </w:pPr>
+            <w:r>
+              <w:rPr>
+                <w:sz w:val="14"/>
+              </w:rPr>
+              <w:t>81.8% [77.4, 86.8]</w:t>
+            </w:r>
+          </w:p>
+        </w:tc>
+        <w:tc>
+          <w:tcPr>
+            <w:tcW w:type="dxa" w:w="1029"/>
+            <w:vAlign w:val="center"/>
+          </w:tcPr>
+          <w:p>
+            <w:pPr>
+              <w:jc w:val="center"/>
+            </w:pPr>
+            <w:r>
+              <w:rPr>
+                <w:sz w:val="14"/>
+              </w:rPr>
+              <w:t>81.3% [78.1, 85.5]</w:t>
+            </w:r>
+          </w:p>
+        </w:tc>
+      </w:tr>
+      <w:tr>
+        <w:tc>
+          <w:tcPr>
+            <w:tcW w:type="dxa" w:w="1029"/>
+            <w:shd w:fill="EAF2F8"/>
+            <w:vAlign w:val="center"/>
+          </w:tcPr>
+          <w:p>
+            <w:pPr>
+              <w:jc w:val="left"/>
+            </w:pPr>
+            <w:r>
+              <w:rPr>
+                <w:sz w:val="14"/>
+              </w:rPr>
+              <w:t>Reference trajectory model</w:t>
+            </w:r>
+          </w:p>
+        </w:tc>
+        <w:tc>
+          <w:tcPr>
+            <w:tcW w:type="dxa" w:w="1029"/>
             <w:vAlign w:val="center"/>
           </w:tcPr>
           <w:p>
@@ -315,7 +892,7 @@
         </w:tc>
         <w:tc>
           <w:tcPr>
-            <w:tcW w:type="dxa" w:w="1440"/>
+            <w:tcW w:type="dxa" w:w="1029"/>
             <w:vAlign w:val="center"/>
           </w:tcPr>
           <w:p>
@@ -332,7 +909,7 @@
         </w:tc>
         <w:tc>
           <w:tcPr>
-            <w:tcW w:type="dxa" w:w="1440"/>
+            <w:tcW w:type="dxa" w:w="1029"/>
             <w:vAlign w:val="center"/>
           </w:tcPr>
           <w:p>
@@ -349,7 +926,7 @@
         </w:tc>
         <w:tc>
           <w:tcPr>
-            <w:tcW w:type="dxa" w:w="1440"/>
+            <w:tcW w:type="dxa" w:w="1029"/>
             <w:vAlign w:val="center"/>
           </w:tcPr>
           <w:p>
@@ -366,7 +943,7 @@
         </w:tc>
         <w:tc>
           <w:tcPr>
-            <w:tcW w:type="dxa" w:w="1440"/>
+            <w:tcW w:type="dxa" w:w="1029"/>
             <w:vAlign w:val="center"/>
           </w:tcPr>
           <w:p>
@@ -383,7 +960,7 @@
         </w:tc>
         <w:tc>
           <w:tcPr>
-            <w:tcW w:type="dxa" w:w="1440"/>
+            <w:tcW w:type="dxa" w:w="1029"/>
             <w:vAlign w:val="center"/>
           </w:tcPr>
           <w:p>
@@ -400,7 +977,7 @@
         </w:tc>
         <w:tc>
           <w:tcPr>
-            <w:tcW w:type="dxa" w:w="1440"/>
+            <w:tcW w:type="dxa" w:w="1029"/>
             <w:vAlign w:val="center"/>
           </w:tcPr>
           <w:p>
@@ -417,7 +994,75 @@
         </w:tc>
         <w:tc>
           <w:tcPr>
-            <w:tcW w:type="dxa" w:w="1440"/>
+            <w:tcW w:type="dxa" w:w="1029"/>
+            <w:vAlign w:val="center"/>
+          </w:tcPr>
+          <w:p>
+            <w:pPr>
+              <w:jc w:val="center"/>
+            </w:pPr>
+            <w:r>
+              <w:rPr>
+                <w:sz w:val="14"/>
+              </w:rPr>
+              <w:t>+0.0000</w:t>
+            </w:r>
+          </w:p>
+        </w:tc>
+        <w:tc>
+          <w:tcPr>
+            <w:tcW w:type="dxa" w:w="1029"/>
+            <w:vAlign w:val="center"/>
+          </w:tcPr>
+          <w:p>
+            <w:pPr>
+              <w:jc w:val="center"/>
+            </w:pPr>
+            <w:r>
+              <w:rPr>
+                <w:sz w:val="14"/>
+              </w:rPr>
+              <w:t>+0.0</w:t>
+            </w:r>
+          </w:p>
+        </w:tc>
+        <w:tc>
+          <w:tcPr>
+            <w:tcW w:type="dxa" w:w="1029"/>
+            <w:vAlign w:val="center"/>
+          </w:tcPr>
+          <w:p>
+            <w:pPr>
+              <w:jc w:val="center"/>
+            </w:pPr>
+            <w:r>
+              <w:rPr>
+                <w:sz w:val="14"/>
+              </w:rPr>
+              <w:t>10.2</w:t>
+            </w:r>
+          </w:p>
+        </w:tc>
+        <w:tc>
+          <w:tcPr>
+            <w:tcW w:type="dxa" w:w="1029"/>
+            <w:vAlign w:val="center"/>
+          </w:tcPr>
+          <w:p>
+            <w:pPr>
+              <w:jc w:val="center"/>
+            </w:pPr>
+            <w:r>
+              <w:rPr>
+                <w:sz w:val="14"/>
+              </w:rPr>
+              <w:t>0.965</w:t>
+            </w:r>
+          </w:p>
+        </w:tc>
+        <w:tc>
+          <w:tcPr>
+            <w:tcW w:type="dxa" w:w="1029"/>
             <w:vAlign w:val="center"/>
           </w:tcPr>
           <w:p>
@@ -434,7 +1079,7 @@
         </w:tc>
         <w:tc>
           <w:tcPr>
-            <w:tcW w:type="dxa" w:w="1440"/>
+            <w:tcW w:type="dxa" w:w="1029"/>
             <w:vAlign w:val="center"/>
           </w:tcPr>
           <w:p>
@@ -453,7 +1098,7 @@
       <w:tr>
         <w:tc>
           <w:tcPr>
-            <w:tcW w:type="dxa" w:w="1440"/>
+            <w:tcW w:type="dxa" w:w="1029"/>
             <w:shd w:fill="EAF2F8"/>
             <w:vAlign w:val="center"/>
           </w:tcPr>
@@ -465,13 +1110,13 @@
               <w:rPr>
                 <w:sz w:val="14"/>
               </w:rPr>
-              <w:t>2</w:t>
+              <w:t>Complexity-sensitive comparison</w:t>
             </w:r>
           </w:p>
         </w:tc>
         <w:tc>
           <w:tcPr>
-            <w:tcW w:type="dxa" w:w="1440"/>
+            <w:tcW w:type="dxa" w:w="1029"/>
             <w:vAlign w:val="center"/>
           </w:tcPr>
           <w:p>
@@ -488,7 +1133,7 @@
         </w:tc>
         <w:tc>
           <w:tcPr>
-            <w:tcW w:type="dxa" w:w="1440"/>
+            <w:tcW w:type="dxa" w:w="1029"/>
             <w:vAlign w:val="center"/>
           </w:tcPr>
           <w:p>
@@ -505,7 +1150,7 @@
         </w:tc>
         <w:tc>
           <w:tcPr>
-            <w:tcW w:type="dxa" w:w="1440"/>
+            <w:tcW w:type="dxa" w:w="1029"/>
             <w:vAlign w:val="center"/>
           </w:tcPr>
           <w:p>
@@ -522,7 +1167,7 @@
         </w:tc>
         <w:tc>
           <w:tcPr>
-            <w:tcW w:type="dxa" w:w="1440"/>
+            <w:tcW w:type="dxa" w:w="1029"/>
             <w:vAlign w:val="center"/>
           </w:tcPr>
           <w:p>
@@ -539,7 +1184,7 @@
         </w:tc>
         <w:tc>
           <w:tcPr>
-            <w:tcW w:type="dxa" w:w="1440"/>
+            <w:tcW w:type="dxa" w:w="1029"/>
             <w:vAlign w:val="center"/>
           </w:tcPr>
           <w:p>
@@ -556,7 +1201,7 @@
         </w:tc>
         <w:tc>
           <w:tcPr>
-            <w:tcW w:type="dxa" w:w="1440"/>
+            <w:tcW w:type="dxa" w:w="1029"/>
             <w:vAlign w:val="center"/>
           </w:tcPr>
           <w:p>
@@ -573,7 +1218,7 @@
         </w:tc>
         <w:tc>
           <w:tcPr>
-            <w:tcW w:type="dxa" w:w="1440"/>
+            <w:tcW w:type="dxa" w:w="1029"/>
             <w:vAlign w:val="center"/>
           </w:tcPr>
           <w:p>
@@ -590,7 +1235,75 @@
         </w:tc>
         <w:tc>
           <w:tcPr>
-            <w:tcW w:type="dxa" w:w="1440"/>
+            <w:tcW w:type="dxa" w:w="1029"/>
+            <w:vAlign w:val="center"/>
+          </w:tcPr>
+          <w:p>
+            <w:pPr>
+              <w:jc w:val="center"/>
+            </w:pPr>
+            <w:r>
+              <w:rPr>
+                <w:sz w:val="14"/>
+              </w:rPr>
+              <w:t>-0.0307</w:t>
+            </w:r>
+          </w:p>
+        </w:tc>
+        <w:tc>
+          <w:tcPr>
+            <w:tcW w:type="dxa" w:w="1029"/>
+            <w:vAlign w:val="center"/>
+          </w:tcPr>
+          <w:p>
+            <w:pPr>
+              <w:jc w:val="center"/>
+            </w:pPr>
+            <w:r>
+              <w:rPr>
+                <w:sz w:val="14"/>
+              </w:rPr>
+              <w:t>+2.7</w:t>
+            </w:r>
+          </w:p>
+        </w:tc>
+        <w:tc>
+          <w:tcPr>
+            <w:tcW w:type="dxa" w:w="1029"/>
+            <w:vAlign w:val="center"/>
+          </w:tcPr>
+          <w:p>
+            <w:pPr>
+              <w:jc w:val="center"/>
+            </w:pPr>
+            <w:r>
+              <w:rPr>
+                <w:sz w:val="14"/>
+              </w:rPr>
+              <w:t>21.0</w:t>
+            </w:r>
+          </w:p>
+        </w:tc>
+        <w:tc>
+          <w:tcPr>
+            <w:tcW w:type="dxa" w:w="1029"/>
+            <w:vAlign w:val="center"/>
+          </w:tcPr>
+          <w:p>
+            <w:pPr>
+              <w:jc w:val="center"/>
+            </w:pPr>
+            <w:r>
+              <w:rPr>
+                <w:sz w:val="14"/>
+              </w:rPr>
+              <w:t>0.937</w:t>
+            </w:r>
+          </w:p>
+        </w:tc>
+        <w:tc>
+          <w:tcPr>
+            <w:tcW w:type="dxa" w:w="1029"/>
             <w:vAlign w:val="center"/>
           </w:tcPr>
           <w:p>
@@ -607,7 +1320,7 @@
         </w:tc>
         <w:tc>
           <w:tcPr>
-            <w:tcW w:type="dxa" w:w="1440"/>
+            <w:tcW w:type="dxa" w:w="1029"/>
             <w:vAlign w:val="center"/>
           </w:tcPr>
           <w:p>
@@ -626,7 +1339,7 @@
       <w:tr>
         <w:tc>
           <w:tcPr>
-            <w:tcW w:type="dxa" w:w="1440"/>
+            <w:tcW w:type="dxa" w:w="1029"/>
             <w:shd w:fill="EAF2F8"/>
             <w:vAlign w:val="center"/>
           </w:tcPr>
@@ -638,13 +1351,13 @@
               <w:rPr>
                 <w:sz w:val="14"/>
               </w:rPr>
-              <w:t>3</w:t>
+              <w:t>Complexity-sensitive comparison</w:t>
             </w:r>
           </w:p>
         </w:tc>
         <w:tc>
           <w:tcPr>
-            <w:tcW w:type="dxa" w:w="1440"/>
+            <w:tcW w:type="dxa" w:w="1029"/>
             <w:vAlign w:val="center"/>
           </w:tcPr>
           <w:p>
@@ -661,7 +1374,7 @@
         </w:tc>
         <w:tc>
           <w:tcPr>
-            <w:tcW w:type="dxa" w:w="1440"/>
+            <w:tcW w:type="dxa" w:w="1029"/>
             <w:vAlign w:val="center"/>
           </w:tcPr>
           <w:p>
@@ -678,7 +1391,7 @@
         </w:tc>
         <w:tc>
           <w:tcPr>
-            <w:tcW w:type="dxa" w:w="1440"/>
+            <w:tcW w:type="dxa" w:w="1029"/>
             <w:vAlign w:val="center"/>
           </w:tcPr>
           <w:p>
@@ -695,7 +1408,7 @@
         </w:tc>
         <w:tc>
           <w:tcPr>
-            <w:tcW w:type="dxa" w:w="1440"/>
+            <w:tcW w:type="dxa" w:w="1029"/>
             <w:vAlign w:val="center"/>
           </w:tcPr>
           <w:p>
@@ -712,7 +1425,7 @@
         </w:tc>
         <w:tc>
           <w:tcPr>
-            <w:tcW w:type="dxa" w:w="1440"/>
+            <w:tcW w:type="dxa" w:w="1029"/>
             <w:vAlign w:val="center"/>
           </w:tcPr>
           <w:p>
@@ -729,7 +1442,7 @@
         </w:tc>
         <w:tc>
           <w:tcPr>
-            <w:tcW w:type="dxa" w:w="1440"/>
+            <w:tcW w:type="dxa" w:w="1029"/>
             <w:vAlign w:val="center"/>
           </w:tcPr>
           <w:p>
@@ -746,7 +1459,7 @@
         </w:tc>
         <w:tc>
           <w:tcPr>
-            <w:tcW w:type="dxa" w:w="1440"/>
+            <w:tcW w:type="dxa" w:w="1029"/>
             <w:vAlign w:val="center"/>
           </w:tcPr>
           <w:p>
@@ -763,7 +1476,75 @@
         </w:tc>
         <w:tc>
           <w:tcPr>
-            <w:tcW w:type="dxa" w:w="1440"/>
+            <w:tcW w:type="dxa" w:w="1029"/>
+            <w:vAlign w:val="center"/>
+          </w:tcPr>
+          <w:p>
+            <w:pPr>
+              <w:jc w:val="center"/>
+            </w:pPr>
+            <w:r>
+              <w:rPr>
+                <w:sz w:val="14"/>
+              </w:rPr>
+              <w:t>-0.0359</w:t>
+            </w:r>
+          </w:p>
+        </w:tc>
+        <w:tc>
+          <w:tcPr>
+            <w:tcW w:type="dxa" w:w="1029"/>
+            <w:vAlign w:val="center"/>
+          </w:tcPr>
+          <w:p>
+            <w:pPr>
+              <w:jc w:val="center"/>
+            </w:pPr>
+            <w:r>
+              <w:rPr>
+                <w:sz w:val="14"/>
+              </w:rPr>
+              <w:t>+3.1</w:t>
+            </w:r>
+          </w:p>
+        </w:tc>
+        <w:tc>
+          <w:tcPr>
+            <w:tcW w:type="dxa" w:w="1029"/>
+            <w:vAlign w:val="center"/>
+          </w:tcPr>
+          <w:p>
+            <w:pPr>
+              <w:jc w:val="center"/>
+            </w:pPr>
+            <w:r>
+              <w:rPr>
+                <w:sz w:val="14"/>
+              </w:rPr>
+              <w:t>26.5</w:t>
+            </w:r>
+          </w:p>
+        </w:tc>
+        <w:tc>
+          <w:tcPr>
+            <w:tcW w:type="dxa" w:w="1029"/>
+            <w:vAlign w:val="center"/>
+          </w:tcPr>
+          <w:p>
+            <w:pPr>
+              <w:jc w:val="center"/>
+            </w:pPr>
+            <w:r>
+              <w:rPr>
+                <w:sz w:val="14"/>
+              </w:rPr>
+              <w:t>0.921</w:t>
+            </w:r>
+          </w:p>
+        </w:tc>
+        <w:tc>
+          <w:tcPr>
+            <w:tcW w:type="dxa" w:w="1029"/>
             <w:vAlign w:val="center"/>
           </w:tcPr>
           <w:p>
@@ -780,7 +1561,7 @@
         </w:tc>
         <w:tc>
           <w:tcPr>
-            <w:tcW w:type="dxa" w:w="1440"/>
+            <w:tcW w:type="dxa" w:w="1029"/>
             <w:vAlign w:val="center"/>
           </w:tcPr>
           <w:p>
@@ -792,352 +1573,6 @@
                 <w:sz w:val="14"/>
               </w:rPr>
               <w:t>74.2% [70.5, 78.8]</w:t>
-            </w:r>
-          </w:p>
-        </w:tc>
-      </w:tr>
-      <w:tr>
-        <w:tc>
-          <w:tcPr>
-            <w:tcW w:type="dxa" w:w="1440"/>
-            <w:shd w:fill="EAF2F8"/>
-            <w:vAlign w:val="center"/>
-          </w:tcPr>
-          <w:p>
-            <w:pPr>
-              <w:jc w:val="left"/>
-            </w:pPr>
-            <w:r>
-              <w:rPr>
-                <w:sz w:val="14"/>
-              </w:rPr>
-              <w:t>4</w:t>
-            </w:r>
-          </w:p>
-        </w:tc>
-        <w:tc>
-          <w:tcPr>
-            <w:tcW w:type="dxa" w:w="1440"/>
-            <w:vAlign w:val="center"/>
-          </w:tcPr>
-          <w:p>
-            <w:pPr>
-              <w:jc w:val="center"/>
-            </w:pPr>
-            <w:r>
-              <w:rPr>
-                <w:sz w:val="14"/>
-              </w:rPr>
-              <w:t>AIMS</w:t>
-            </w:r>
-          </w:p>
-        </w:tc>
-        <w:tc>
-          <w:tcPr>
-            <w:tcW w:type="dxa" w:w="1440"/>
-            <w:vAlign w:val="center"/>
-          </w:tcPr>
-          <w:p>
-            <w:pPr>
-              <w:jc w:val="center"/>
-            </w:pPr>
-            <w:r>
-              <w:rPr>
-                <w:sz w:val="14"/>
-              </w:rPr>
-              <w:t>Admission Impairment Mobility Score</w:t>
-            </w:r>
-          </w:p>
-        </w:tc>
-        <w:tc>
-          <w:tcPr>
-            <w:tcW w:type="dxa" w:w="1440"/>
-            <w:vAlign w:val="center"/>
-          </w:tcPr>
-          <w:p>
-            <w:pPr>
-              <w:jc w:val="center"/>
-            </w:pPr>
-            <w:r>
-              <w:rPr>
-                <w:sz w:val="14"/>
-              </w:rPr>
-              <w:t>12</w:t>
-            </w:r>
-          </w:p>
-        </w:tc>
-        <w:tc>
-          <w:tcPr>
-            <w:tcW w:type="dxa" w:w="1440"/>
-            <w:vAlign w:val="center"/>
-          </w:tcPr>
-          <w:p>
-            <w:pPr>
-              <w:jc w:val="center"/>
-            </w:pPr>
-            <w:r>
-              <w:rPr>
-                <w:sz w:val="14"/>
-              </w:rPr>
-              <w:t>0.4906</w:t>
-            </w:r>
-          </w:p>
-        </w:tc>
-        <w:tc>
-          <w:tcPr>
-            <w:tcW w:type="dxa" w:w="1440"/>
-            <w:vAlign w:val="center"/>
-          </w:tcPr>
-          <w:p>
-            <w:pPr>
-              <w:jc w:val="center"/>
-            </w:pPr>
-            <w:r>
-              <w:rPr>
-                <w:sz w:val="14"/>
-              </w:rPr>
-              <w:t>95.07</w:t>
-            </w:r>
-          </w:p>
-        </w:tc>
-        <w:tc>
-          <w:tcPr>
-            <w:tcW w:type="dxa" w:w="1440"/>
-            <w:vAlign w:val="center"/>
-          </w:tcPr>
-          <w:p>
-            <w:pPr>
-              <w:jc w:val="center"/>
-            </w:pPr>
-            <w:r>
-              <w:rPr>
-                <w:sz w:val="14"/>
-              </w:rPr>
-              <w:t>0.4922</w:t>
-            </w:r>
-          </w:p>
-        </w:tc>
-        <w:tc>
-          <w:tcPr>
-            <w:tcW w:type="dxa" w:w="1440"/>
-            <w:vAlign w:val="center"/>
-          </w:tcPr>
-          <w:p>
-            <w:pPr>
-              <w:jc w:val="center"/>
-            </w:pPr>
-            <w:r>
-              <w:rPr>
-                <w:sz w:val="14"/>
-              </w:rPr>
-              <w:t>94.6</w:t>
-            </w:r>
-          </w:p>
-        </w:tc>
-        <w:tc>
-          <w:tcPr>
-            <w:tcW w:type="dxa" w:w="1440"/>
-            <w:vAlign w:val="center"/>
-          </w:tcPr>
-          <w:p>
-            <w:pPr>
-              <w:jc w:val="center"/>
-            </w:pPr>
-            <w:r>
-              <w:rPr>
-                <w:sz w:val="14"/>
-              </w:rPr>
-              <w:t>81.8% [77.4, 86.8]</w:t>
-            </w:r>
-          </w:p>
-        </w:tc>
-        <w:tc>
-          <w:tcPr>
-            <w:tcW w:type="dxa" w:w="1440"/>
-            <w:vAlign w:val="center"/>
-          </w:tcPr>
-          <w:p>
-            <w:pPr>
-              <w:jc w:val="center"/>
-            </w:pPr>
-            <w:r>
-              <w:rPr>
-                <w:sz w:val="14"/>
-              </w:rPr>
-              <w:t>81.3% [78.1, 85.5]</w:t>
-            </w:r>
-          </w:p>
-        </w:tc>
-      </w:tr>
-      <w:tr>
-        <w:tc>
-          <w:tcPr>
-            <w:tcW w:type="dxa" w:w="1440"/>
-            <w:shd w:fill="EAF2F8"/>
-            <w:vAlign w:val="center"/>
-          </w:tcPr>
-          <w:p>
-            <w:pPr>
-              <w:jc w:val="left"/>
-            </w:pPr>
-            <w:r>
-              <w:rPr>
-                <w:sz w:val="14"/>
-              </w:rPr>
-              <w:t>5</w:t>
-            </w:r>
-          </w:p>
-        </w:tc>
-        <w:tc>
-          <w:tcPr>
-            <w:tcW w:type="dxa" w:w="1440"/>
-            <w:vAlign w:val="center"/>
-          </w:tcPr>
-          <w:p>
-            <w:pPr>
-              <w:jc w:val="center"/>
-            </w:pPr>
-            <w:r>
-              <w:rPr>
-                <w:sz w:val="14"/>
-              </w:rPr>
-              <w:t>BEDSIDE</w:t>
-            </w:r>
-          </w:p>
-        </w:tc>
-        <w:tc>
-          <w:tcPr>
-            <w:tcW w:type="dxa" w:w="1440"/>
-            <w:vAlign w:val="center"/>
-          </w:tcPr>
-          <w:p>
-            <w:pPr>
-              <w:jc w:val="center"/>
-            </w:pPr>
-            <w:r>
-              <w:rPr>
-                <w:sz w:val="14"/>
-              </w:rPr>
-              <w:t>Balance-Enhanced Demographic Speed Index for Discharge Endurance</w:t>
-            </w:r>
-          </w:p>
-        </w:tc>
-        <w:tc>
-          <w:tcPr>
-            <w:tcW w:type="dxa" w:w="1440"/>
-            <w:vAlign w:val="center"/>
-          </w:tcPr>
-          <w:p>
-            <w:pPr>
-              <w:jc w:val="center"/>
-            </w:pPr>
-            <w:r>
-              <w:rPr>
-                <w:sz w:val="14"/>
-              </w:rPr>
-              <w:t>4</w:t>
-            </w:r>
-          </w:p>
-        </w:tc>
-        <w:tc>
-          <w:tcPr>
-            <w:tcW w:type="dxa" w:w="1440"/>
-            <w:vAlign w:val="center"/>
-          </w:tcPr>
-          <w:p>
-            <w:pPr>
-              <w:jc w:val="center"/>
-            </w:pPr>
-            <w:r>
-              <w:rPr>
-                <w:sz w:val="14"/>
-              </w:rPr>
-              <w:t>0.4836</w:t>
-            </w:r>
-          </w:p>
-        </w:tc>
-        <w:tc>
-          <w:tcPr>
-            <w:tcW w:type="dxa" w:w="1440"/>
-            <w:vAlign w:val="center"/>
-          </w:tcPr>
-          <w:p>
-            <w:pPr>
-              <w:jc w:val="center"/>
-            </w:pPr>
-            <w:r>
-              <w:rPr>
-                <w:sz w:val="14"/>
-              </w:rPr>
-              <w:t>95.35</w:t>
-            </w:r>
-          </w:p>
-        </w:tc>
-        <w:tc>
-          <w:tcPr>
-            <w:tcW w:type="dxa" w:w="1440"/>
-            <w:vAlign w:val="center"/>
-          </w:tcPr>
-          <w:p>
-            <w:pPr>
-              <w:jc w:val="center"/>
-            </w:pPr>
-            <w:r>
-              <w:rPr>
-                <w:sz w:val="14"/>
-              </w:rPr>
-              <w:t>0.4906</w:t>
-            </w:r>
-          </w:p>
-        </w:tc>
-        <w:tc>
-          <w:tcPr>
-            <w:tcW w:type="dxa" w:w="1440"/>
-            <w:vAlign w:val="center"/>
-          </w:tcPr>
-          <w:p>
-            <w:pPr>
-              <w:jc w:val="center"/>
-            </w:pPr>
-            <w:r>
-              <w:rPr>
-                <w:sz w:val="14"/>
-              </w:rPr>
-              <w:t>95.0</w:t>
-            </w:r>
-          </w:p>
-        </w:tc>
-        <w:tc>
-          <w:tcPr>
-            <w:tcW w:type="dxa" w:w="1440"/>
-            <w:vAlign w:val="center"/>
-          </w:tcPr>
-          <w:p>
-            <w:pPr>
-              <w:jc w:val="center"/>
-            </w:pPr>
-            <w:r>
-              <w:rPr>
-                <w:sz w:val="14"/>
-              </w:rPr>
-              <w:t>82.0% [77.8, 86.8]</w:t>
-            </w:r>
-          </w:p>
-        </w:tc>
-        <w:tc>
-          <w:tcPr>
-            <w:tcW w:type="dxa" w:w="1440"/>
-            <w:vAlign w:val="center"/>
-          </w:tcPr>
-          <w:p>
-            <w:pPr>
-              <w:jc w:val="center"/>
-            </w:pPr>
-            <w:r>
-              <w:rPr>
-                <w:sz w:val="14"/>
-              </w:rPr>
-              <w:t>83.0% [79.6, 87.1]</w:t>
             </w:r>
           </w:p>
         </w:tc>
@@ -1164,7 +1599,7 @@
         <w:rPr>
           <w:sz w:val="16"/>
         </w:rPr>
-        <w:t>Rows are stable predictors retained in at least 2 models. Cells show bootstrap mean standardized β and selection frequency. Predictors unique to a single model and full confidence-interval details are reported in the supplementary tables.</w:t>
+        <w:t>Rows are stable predictors retained in at least 2 models. Cells show bootstrap mean standardized β and selection frequency, reordered to place the parsimonious deployment models first.</w:t>
       </w:r>
     </w:p>
     <w:tbl>
@@ -1227,7 +1662,7 @@
                 <w:color w:val="FFFFFF"/>
                 <w:sz w:val="14"/>
               </w:rPr>
-              <w:t>1. RESTORE (n=21)</w:t>
+              <w:t>BEDSIDE (n=4)</w:t>
             </w:r>
           </w:p>
         </w:tc>
@@ -1247,7 +1682,7 @@
                 <w:color w:val="FFFFFF"/>
                 <w:sz w:val="14"/>
               </w:rPr>
-              <w:t>2. COMPASS (n=44)</w:t>
+              <w:t>AIMS (n=12)</w:t>
             </w:r>
           </w:p>
         </w:tc>
@@ -1267,7 +1702,7 @@
                 <w:color w:val="FFFFFF"/>
                 <w:sz w:val="14"/>
               </w:rPr>
-              <w:t>3. CASCADE (n=59)</w:t>
+              <w:t>RESTORE (n=21)</w:t>
             </w:r>
           </w:p>
         </w:tc>
@@ -1287,7 +1722,7 @@
                 <w:color w:val="FFFFFF"/>
                 <w:sz w:val="14"/>
               </w:rPr>
-              <w:t>4. AIMS (n=12)</w:t>
+              <w:t>COMPASS (n=44)</w:t>
             </w:r>
           </w:p>
         </w:tc>
@@ -1307,7 +1742,7 @@
                 <w:color w:val="FFFFFF"/>
                 <w:sz w:val="14"/>
               </w:rPr>
-              <w:t>5. BEDSIDE (n=4)</w:t>
+              <w:t>CASCADE (n=59)</w:t>
             </w:r>
           </w:p>
         </w:tc>
@@ -1328,6 +1763,40 @@
                 <w:sz w:val="14"/>
               </w:rPr>
               <w:t>BBS1</w:t>
+            </w:r>
+          </w:p>
+        </w:tc>
+        <w:tc>
+          <w:tcPr>
+            <w:tcW w:type="dxa" w:w="2400"/>
+            <w:vAlign w:val="center"/>
+          </w:tcPr>
+          <w:p>
+            <w:pPr>
+              <w:jc w:val="center"/>
+            </w:pPr>
+            <w:r>
+              <w:rPr>
+                <w:sz w:val="14"/>
+              </w:rPr>
+              <w:t>68.6; 100%</w:t>
+            </w:r>
+          </w:p>
+        </w:tc>
+        <w:tc>
+          <w:tcPr>
+            <w:tcW w:type="dxa" w:w="2400"/>
+            <w:vAlign w:val="center"/>
+          </w:tcPr>
+          <w:p>
+            <w:pPr>
+              <w:jc w:val="center"/>
+            </w:pPr>
+            <w:r>
+              <w:rPr>
+                <w:sz w:val="14"/>
+              </w:rPr>
+              <w:t>61.2; 100%</w:t>
             </w:r>
           </w:p>
         </w:tc>
@@ -1382,40 +1851,6 @@
             </w:r>
           </w:p>
         </w:tc>
-        <w:tc>
-          <w:tcPr>
-            <w:tcW w:type="dxa" w:w="2400"/>
-            <w:vAlign w:val="center"/>
-          </w:tcPr>
-          <w:p>
-            <w:pPr>
-              <w:jc w:val="center"/>
-            </w:pPr>
-            <w:r>
-              <w:rPr>
-                <w:sz w:val="14"/>
-              </w:rPr>
-              <w:t>61.2; 100%</w:t>
-            </w:r>
-          </w:p>
-        </w:tc>
-        <w:tc>
-          <w:tcPr>
-            <w:tcW w:type="dxa" w:w="2400"/>
-            <w:vAlign w:val="center"/>
-          </w:tcPr>
-          <w:p>
-            <w:pPr>
-              <w:jc w:val="center"/>
-            </w:pPr>
-            <w:r>
-              <w:rPr>
-                <w:sz w:val="14"/>
-              </w:rPr>
-              <w:t>68.6; 100%</w:t>
-            </w:r>
-          </w:p>
-        </w:tc>
       </w:tr>
       <w:tr>
         <w:tc>
@@ -1433,6 +1868,40 @@
                 <w:sz w:val="14"/>
               </w:rPr>
               <w:t>Age</w:t>
+            </w:r>
+          </w:p>
+        </w:tc>
+        <w:tc>
+          <w:tcPr>
+            <w:tcW w:type="dxa" w:w="2400"/>
+            <w:vAlign w:val="center"/>
+          </w:tcPr>
+          <w:p>
+            <w:pPr>
+              <w:jc w:val="center"/>
+            </w:pPr>
+            <w:r>
+              <w:rPr>
+                <w:sz w:val="14"/>
+              </w:rPr>
+              <w:t>-35.1; 100%</w:t>
+            </w:r>
+          </w:p>
+        </w:tc>
+        <w:tc>
+          <w:tcPr>
+            <w:tcW w:type="dxa" w:w="2400"/>
+            <w:vAlign w:val="center"/>
+          </w:tcPr>
+          <w:p>
+            <w:pPr>
+              <w:jc w:val="center"/>
+            </w:pPr>
+            <w:r>
+              <w:rPr>
+                <w:sz w:val="14"/>
+              </w:rPr>
+              <w:t>-39.6; 100%</w:t>
             </w:r>
           </w:p>
         </w:tc>
@@ -1487,40 +1956,6 @@
             </w:r>
           </w:p>
         </w:tc>
-        <w:tc>
-          <w:tcPr>
-            <w:tcW w:type="dxa" w:w="2400"/>
-            <w:vAlign w:val="center"/>
-          </w:tcPr>
-          <w:p>
-            <w:pPr>
-              <w:jc w:val="center"/>
-            </w:pPr>
-            <w:r>
-              <w:rPr>
-                <w:sz w:val="14"/>
-              </w:rPr>
-              <w:t>-39.6; 100%</w:t>
-            </w:r>
-          </w:p>
-        </w:tc>
-        <w:tc>
-          <w:tcPr>
-            <w:tcW w:type="dxa" w:w="2400"/>
-            <w:vAlign w:val="center"/>
-          </w:tcPr>
-          <w:p>
-            <w:pPr>
-              <w:jc w:val="center"/>
-            </w:pPr>
-            <w:r>
-              <w:rPr>
-                <w:sz w:val="14"/>
-              </w:rPr>
-              <w:t>-35.1; 100%</w:t>
-            </w:r>
-          </w:p>
-        </w:tc>
       </w:tr>
       <w:tr>
         <w:tc>
@@ -1538,6 +1973,40 @@
                 <w:sz w:val="14"/>
               </w:rPr>
               <w:t>Gait_Speed_1_Imputed</w:t>
+            </w:r>
+          </w:p>
+        </w:tc>
+        <w:tc>
+          <w:tcPr>
+            <w:tcW w:type="dxa" w:w="2400"/>
+            <w:vAlign w:val="center"/>
+          </w:tcPr>
+          <w:p>
+            <w:pPr>
+              <w:jc w:val="center"/>
+            </w:pPr>
+            <w:r>
+              <w:rPr>
+                <w:sz w:val="14"/>
+              </w:rPr>
+              <w:t>38.3; 100%</w:t>
+            </w:r>
+          </w:p>
+        </w:tc>
+        <w:tc>
+          <w:tcPr>
+            <w:tcW w:type="dxa" w:w="2400"/>
+            <w:vAlign w:val="center"/>
+          </w:tcPr>
+          <w:p>
+            <w:pPr>
+              <w:jc w:val="center"/>
+            </w:pPr>
+            <w:r>
+              <w:rPr>
+                <w:sz w:val="14"/>
+              </w:rPr>
+              <w:t>33.1; 100%</w:t>
             </w:r>
           </w:p>
         </w:tc>
@@ -1592,40 +2061,6 @@
             </w:r>
           </w:p>
         </w:tc>
-        <w:tc>
-          <w:tcPr>
-            <w:tcW w:type="dxa" w:w="2400"/>
-            <w:vAlign w:val="center"/>
-          </w:tcPr>
-          <w:p>
-            <w:pPr>
-              <w:jc w:val="center"/>
-            </w:pPr>
-            <w:r>
-              <w:rPr>
-                <w:sz w:val="14"/>
-              </w:rPr>
-              <w:t>33.1; 100%</w:t>
-            </w:r>
-          </w:p>
-        </w:tc>
-        <w:tc>
-          <w:tcPr>
-            <w:tcW w:type="dxa" w:w="2400"/>
-            <w:vAlign w:val="center"/>
-          </w:tcPr>
-          <w:p>
-            <w:pPr>
-              <w:jc w:val="center"/>
-            </w:pPr>
-            <w:r>
-              <w:rPr>
-                <w:sz w:val="14"/>
-              </w:rPr>
-              <w:t>38.3; 100%</w:t>
-            </w:r>
-          </w:p>
-        </w:tc>
       </w:tr>
       <w:tr>
         <w:tc>
@@ -1643,6 +2078,40 @@
                 <w:sz w:val="14"/>
               </w:rPr>
               <w:t>Sex, F0 M1</w:t>
+            </w:r>
+          </w:p>
+        </w:tc>
+        <w:tc>
+          <w:tcPr>
+            <w:tcW w:type="dxa" w:w="2400"/>
+            <w:vAlign w:val="center"/>
+          </w:tcPr>
+          <w:p>
+            <w:pPr>
+              <w:jc w:val="center"/>
+            </w:pPr>
+            <w:r>
+              <w:rPr>
+                <w:sz w:val="14"/>
+              </w:rPr>
+              <w:t>17.6; 100%</w:t>
+            </w:r>
+          </w:p>
+        </w:tc>
+        <w:tc>
+          <w:tcPr>
+            <w:tcW w:type="dxa" w:w="2400"/>
+            <w:vAlign w:val="center"/>
+          </w:tcPr>
+          <w:p>
+            <w:pPr>
+              <w:jc w:val="center"/>
+            </w:pPr>
+            <w:r>
+              <w:rPr>
+                <w:sz w:val="14"/>
+              </w:rPr>
+              <w:t>15.5; 100%</w:t>
             </w:r>
           </w:p>
         </w:tc>
@@ -1697,40 +2166,6 @@
             </w:r>
           </w:p>
         </w:tc>
-        <w:tc>
-          <w:tcPr>
-            <w:tcW w:type="dxa" w:w="2400"/>
-            <w:vAlign w:val="center"/>
-          </w:tcPr>
-          <w:p>
-            <w:pPr>
-              <w:jc w:val="center"/>
-            </w:pPr>
-            <w:r>
-              <w:rPr>
-                <w:sz w:val="14"/>
-              </w:rPr>
-              <w:t>15.5; 100%</w:t>
-            </w:r>
-          </w:p>
-        </w:tc>
-        <w:tc>
-          <w:tcPr>
-            <w:tcW w:type="dxa" w:w="2400"/>
-            <w:vAlign w:val="center"/>
-          </w:tcPr>
-          <w:p>
-            <w:pPr>
-              <w:jc w:val="center"/>
-            </w:pPr>
-            <w:r>
-              <w:rPr>
-                <w:sz w:val="14"/>
-              </w:rPr>
-              <w:t>17.6; 100%</w:t>
-            </w:r>
-          </w:p>
-        </w:tc>
       </w:tr>
       <w:tr>
         <w:tc>
@@ -1748,6 +2183,40 @@
                 <w:sz w:val="14"/>
               </w:rPr>
               <w:t>FuglUE1</w:t>
+            </w:r>
+          </w:p>
+        </w:tc>
+        <w:tc>
+          <w:tcPr>
+            <w:tcW w:type="dxa" w:w="2400"/>
+            <w:vAlign w:val="center"/>
+          </w:tcPr>
+          <w:p>
+            <w:pPr>
+              <w:jc w:val="center"/>
+            </w:pPr>
+            <w:r>
+              <w:rPr>
+                <w:sz w:val="14"/>
+              </w:rPr>
+              <w:t>—</w:t>
+            </w:r>
+          </w:p>
+        </w:tc>
+        <w:tc>
+          <w:tcPr>
+            <w:tcW w:type="dxa" w:w="2400"/>
+            <w:vAlign w:val="center"/>
+          </w:tcPr>
+          <w:p>
+            <w:pPr>
+              <w:jc w:val="center"/>
+            </w:pPr>
+            <w:r>
+              <w:rPr>
+                <w:sz w:val="14"/>
+              </w:rPr>
+              <w:t>23.7; 100%</w:t>
             </w:r>
           </w:p>
         </w:tc>
@@ -1802,20 +2271,23 @@
             </w:r>
           </w:p>
         </w:tc>
+      </w:tr>
+      <w:tr>
         <w:tc>
           <w:tcPr>
             <w:tcW w:type="dxa" w:w="2400"/>
+            <w:shd w:fill="EAF2F8"/>
             <w:vAlign w:val="center"/>
           </w:tcPr>
           <w:p>
             <w:pPr>
-              <w:jc w:val="center"/>
+              <w:jc w:val="left"/>
             </w:pPr>
             <w:r>
               <w:rPr>
                 <w:sz w:val="14"/>
               </w:rPr>
-              <w:t>23.7; 100%</w:t>
+              <w:t>EuroQoL5D1</w:t>
             </w:r>
           </w:p>
         </w:tc>
@@ -1836,23 +2308,20 @@
             </w:r>
           </w:p>
         </w:tc>
-      </w:tr>
-      <w:tr>
         <w:tc>
           <w:tcPr>
             <w:tcW w:type="dxa" w:w="2400"/>
-            <w:shd w:fill="EAF2F8"/>
             <w:vAlign w:val="center"/>
           </w:tcPr>
           <w:p>
             <w:pPr>
-              <w:jc w:val="left"/>
+              <w:jc w:val="center"/>
             </w:pPr>
             <w:r>
               <w:rPr>
                 <w:sz w:val="14"/>
               </w:rPr>
-              <w:t>EuroQoL5D1</w:t>
+              <w:t>10.7; 95%</w:t>
             </w:r>
           </w:p>
         </w:tc>
@@ -1907,20 +2376,23 @@
             </w:r>
           </w:p>
         </w:tc>
+      </w:tr>
+      <w:tr>
         <w:tc>
           <w:tcPr>
             <w:tcW w:type="dxa" w:w="2400"/>
+            <w:shd w:fill="EAF2F8"/>
             <w:vAlign w:val="center"/>
           </w:tcPr>
           <w:p>
             <w:pPr>
-              <w:jc w:val="center"/>
+              <w:jc w:val="left"/>
             </w:pPr>
             <w:r>
               <w:rPr>
                 <w:sz w:val="14"/>
               </w:rPr>
-              <w:t>10.7; 95%</w:t>
+              <w:t>MNA1</w:t>
             </w:r>
           </w:p>
         </w:tc>
@@ -1941,23 +2413,20 @@
             </w:r>
           </w:p>
         </w:tc>
-      </w:tr>
-      <w:tr>
         <w:tc>
           <w:tcPr>
             <w:tcW w:type="dxa" w:w="2400"/>
-            <w:shd w:fill="EAF2F8"/>
             <w:vAlign w:val="center"/>
           </w:tcPr>
           <w:p>
             <w:pPr>
-              <w:jc w:val="left"/>
+              <w:jc w:val="center"/>
             </w:pPr>
             <w:r>
               <w:rPr>
                 <w:sz w:val="14"/>
               </w:rPr>
-              <w:t>MNA1</w:t>
+              <w:t>-11.9; 97%</w:t>
             </w:r>
           </w:p>
         </w:tc>
@@ -2012,20 +2481,23 @@
             </w:r>
           </w:p>
         </w:tc>
+      </w:tr>
+      <w:tr>
         <w:tc>
           <w:tcPr>
             <w:tcW w:type="dxa" w:w="2400"/>
+            <w:shd w:fill="EAF2F8"/>
             <w:vAlign w:val="center"/>
           </w:tcPr>
           <w:p>
             <w:pPr>
-              <w:jc w:val="center"/>
+              <w:jc w:val="left"/>
             </w:pPr>
             <w:r>
               <w:rPr>
                 <w:sz w:val="14"/>
               </w:rPr>
-              <w:t>-11.9; 97%</w:t>
+              <w:t>MRS1</w:t>
             </w:r>
           </w:p>
         </w:tc>
@@ -2046,23 +2518,20 @@
             </w:r>
           </w:p>
         </w:tc>
-      </w:tr>
-      <w:tr>
         <w:tc>
           <w:tcPr>
             <w:tcW w:type="dxa" w:w="2400"/>
-            <w:shd w:fill="EAF2F8"/>
             <w:vAlign w:val="center"/>
           </w:tcPr>
           <w:p>
             <w:pPr>
-              <w:jc w:val="left"/>
+              <w:jc w:val="center"/>
             </w:pPr>
             <w:r>
               <w:rPr>
                 <w:sz w:val="14"/>
               </w:rPr>
-              <w:t>MRS1</w:t>
+              <w:t>-6.4; 82%</w:t>
             </w:r>
           </w:p>
         </w:tc>
@@ -2117,20 +2586,23 @@
             </w:r>
           </w:p>
         </w:tc>
+      </w:tr>
+      <w:tr>
         <w:tc>
           <w:tcPr>
             <w:tcW w:type="dxa" w:w="2400"/>
+            <w:shd w:fill="EAF2F8"/>
             <w:vAlign w:val="center"/>
           </w:tcPr>
           <w:p>
             <w:pPr>
-              <w:jc w:val="center"/>
+              <w:jc w:val="left"/>
             </w:pPr>
             <w:r>
               <w:rPr>
                 <w:sz w:val="14"/>
               </w:rPr>
-              <w:t>-6.4; 82%</w:t>
+              <w:t>IADL1</w:t>
             </w:r>
           </w:p>
         </w:tc>
@@ -2151,23 +2623,20 @@
             </w:r>
           </w:p>
         </w:tc>
-      </w:tr>
-      <w:tr>
         <w:tc>
           <w:tcPr>
             <w:tcW w:type="dxa" w:w="2400"/>
-            <w:shd w:fill="EAF2F8"/>
             <w:vAlign w:val="center"/>
           </w:tcPr>
           <w:p>
             <w:pPr>
-              <w:jc w:val="left"/>
+              <w:jc w:val="center"/>
             </w:pPr>
             <w:r>
               <w:rPr>
                 <w:sz w:val="14"/>
               </w:rPr>
-              <w:t>IADL1</w:t>
+              <w:t>-5.1; 77%</w:t>
             </w:r>
           </w:p>
         </w:tc>
@@ -2222,20 +2691,23 @@
             </w:r>
           </w:p>
         </w:tc>
+      </w:tr>
+      <w:tr>
         <w:tc>
           <w:tcPr>
             <w:tcW w:type="dxa" w:w="2400"/>
+            <w:shd w:fill="EAF2F8"/>
             <w:vAlign w:val="center"/>
           </w:tcPr>
           <w:p>
             <w:pPr>
-              <w:jc w:val="center"/>
+              <w:jc w:val="left"/>
             </w:pPr>
             <w:r>
               <w:rPr>
                 <w:sz w:val="14"/>
               </w:rPr>
-              <w:t>-5.1; 77%</w:t>
+              <w:t>GIB</w:t>
             </w:r>
           </w:p>
         </w:tc>
@@ -2256,23 +2728,20 @@
             </w:r>
           </w:p>
         </w:tc>
-      </w:tr>
-      <w:tr>
         <w:tc>
           <w:tcPr>
             <w:tcW w:type="dxa" w:w="2400"/>
-            <w:shd w:fill="EAF2F8"/>
             <w:vAlign w:val="center"/>
           </w:tcPr>
           <w:p>
             <w:pPr>
-              <w:jc w:val="left"/>
+              <w:jc w:val="center"/>
             </w:pPr>
             <w:r>
               <w:rPr>
                 <w:sz w:val="14"/>
               </w:rPr>
-              <w:t>GIB</w:t>
+              <w:t>—</w:t>
             </w:r>
           </w:p>
         </w:tc>
@@ -2327,6 +2796,26 @@
             </w:r>
           </w:p>
         </w:tc>
+      </w:tr>
+      <w:tr>
+        <w:tc>
+          <w:tcPr>
+            <w:tcW w:type="dxa" w:w="2400"/>
+            <w:shd w:fill="EAF2F8"/>
+            <w:vAlign w:val="center"/>
+          </w:tcPr>
+          <w:p>
+            <w:pPr>
+              <w:jc w:val="left"/>
+            </w:pPr>
+            <w:r>
+              <w:rPr>
+                <w:sz w:val="14"/>
+              </w:rPr>
+              <w:t>OldStroke</w:t>
+            </w:r>
+          </w:p>
+        </w:tc>
         <w:tc>
           <w:tcPr>
             <w:tcW w:type="dxa" w:w="2400"/>
@@ -2358,26 +2847,6 @@
                 <w:sz w:val="14"/>
               </w:rPr>
               <w:t>—</w:t>
-            </w:r>
-          </w:p>
-        </w:tc>
-      </w:tr>
-      <w:tr>
-        <w:tc>
-          <w:tcPr>
-            <w:tcW w:type="dxa" w:w="2400"/>
-            <w:shd w:fill="EAF2F8"/>
-            <w:vAlign w:val="center"/>
-          </w:tcPr>
-          <w:p>
-            <w:pPr>
-              <w:jc w:val="left"/>
-            </w:pPr>
-            <w:r>
-              <w:rPr>
-                <w:sz w:val="14"/>
-              </w:rPr>
-              <w:t>OldStroke</w:t>
             </w:r>
           </w:p>
         </w:tc>
@@ -2432,6 +2901,26 @@
             </w:r>
           </w:p>
         </w:tc>
+      </w:tr>
+      <w:tr>
+        <w:tc>
+          <w:tcPr>
+            <w:tcW w:type="dxa" w:w="2400"/>
+            <w:shd w:fill="EAF2F8"/>
+            <w:vAlign w:val="center"/>
+          </w:tcPr>
+          <w:p>
+            <w:pPr>
+              <w:jc w:val="left"/>
+            </w:pPr>
+            <w:r>
+              <w:rPr>
+                <w:sz w:val="14"/>
+              </w:rPr>
+              <w:t>Dyslipidemia</w:t>
+            </w:r>
+          </w:p>
+        </w:tc>
         <w:tc>
           <w:tcPr>
             <w:tcW w:type="dxa" w:w="2400"/>
@@ -2463,26 +2952,6 @@
                 <w:sz w:val="14"/>
               </w:rPr>
               <w:t>—</w:t>
-            </w:r>
-          </w:p>
-        </w:tc>
-      </w:tr>
-      <w:tr>
-        <w:tc>
-          <w:tcPr>
-            <w:tcW w:type="dxa" w:w="2400"/>
-            <w:shd w:fill="EAF2F8"/>
-            <w:vAlign w:val="center"/>
-          </w:tcPr>
-          <w:p>
-            <w:pPr>
-              <w:jc w:val="left"/>
-            </w:pPr>
-            <w:r>
-              <w:rPr>
-                <w:sz w:val="14"/>
-              </w:rPr>
-              <w:t>Dyslipidemia</w:t>
             </w:r>
           </w:p>
         </w:tc>
@@ -2537,6 +3006,26 @@
             </w:r>
           </w:p>
         </w:tc>
+      </w:tr>
+      <w:tr>
+        <w:tc>
+          <w:tcPr>
+            <w:tcW w:type="dxa" w:w="2400"/>
+            <w:shd w:fill="EAF2F8"/>
+            <w:vAlign w:val="center"/>
+          </w:tcPr>
+          <w:p>
+            <w:pPr>
+              <w:jc w:val="left"/>
+            </w:pPr>
+            <w:r>
+              <w:rPr>
+                <w:sz w:val="14"/>
+              </w:rPr>
+              <w:t>Loc_Subcortical</w:t>
+            </w:r>
+          </w:p>
+        </w:tc>
         <w:tc>
           <w:tcPr>
             <w:tcW w:type="dxa" w:w="2400"/>
@@ -2568,26 +3057,6 @@
                 <w:sz w:val="14"/>
               </w:rPr>
               <w:t>—</w:t>
-            </w:r>
-          </w:p>
-        </w:tc>
-      </w:tr>
-      <w:tr>
-        <w:tc>
-          <w:tcPr>
-            <w:tcW w:type="dxa" w:w="2400"/>
-            <w:shd w:fill="EAF2F8"/>
-            <w:vAlign w:val="center"/>
-          </w:tcPr>
-          <w:p>
-            <w:pPr>
-              <w:jc w:val="left"/>
-            </w:pPr>
-            <w:r>
-              <w:rPr>
-                <w:sz w:val="14"/>
-              </w:rPr>
-              <w:t>Loc_Subcortical</w:t>
             </w:r>
           </w:p>
         </w:tc>
@@ -2642,6 +3111,26 @@
             </w:r>
           </w:p>
         </w:tc>
+      </w:tr>
+      <w:tr>
+        <w:tc>
+          <w:tcPr>
+            <w:tcW w:type="dxa" w:w="2400"/>
+            <w:shd w:fill="EAF2F8"/>
+            <w:vAlign w:val="center"/>
+          </w:tcPr>
+          <w:p>
+            <w:pPr>
+              <w:jc w:val="left"/>
+            </w:pPr>
+            <w:r>
+              <w:rPr>
+                <w:sz w:val="14"/>
+              </w:rPr>
+              <w:t>CKD</w:t>
+            </w:r>
+          </w:p>
+        </w:tc>
         <w:tc>
           <w:tcPr>
             <w:tcW w:type="dxa" w:w="2400"/>
@@ -2673,26 +3162,6 @@
                 <w:sz w:val="14"/>
               </w:rPr>
               <w:t>—</w:t>
-            </w:r>
-          </w:p>
-        </w:tc>
-      </w:tr>
-      <w:tr>
-        <w:tc>
-          <w:tcPr>
-            <w:tcW w:type="dxa" w:w="2400"/>
-            <w:shd w:fill="EAF2F8"/>
-            <w:vAlign w:val="center"/>
-          </w:tcPr>
-          <w:p>
-            <w:pPr>
-              <w:jc w:val="left"/>
-            </w:pPr>
-            <w:r>
-              <w:rPr>
-                <w:sz w:val="14"/>
-              </w:rPr>
-              <w:t>CKD</w:t>
             </w:r>
           </w:p>
         </w:tc>
@@ -2747,6 +3216,26 @@
             </w:r>
           </w:p>
         </w:tc>
+      </w:tr>
+      <w:tr>
+        <w:tc>
+          <w:tcPr>
+            <w:tcW w:type="dxa" w:w="2400"/>
+            <w:shd w:fill="EAF2F8"/>
+            <w:vAlign w:val="center"/>
+          </w:tcPr>
+          <w:p>
+            <w:pPr>
+              <w:jc w:val="left"/>
+            </w:pPr>
+            <w:r>
+              <w:rPr>
+                <w:sz w:val="14"/>
+              </w:rPr>
+              <w:t>Dementia</w:t>
+            </w:r>
+          </w:p>
+        </w:tc>
         <w:tc>
           <w:tcPr>
             <w:tcW w:type="dxa" w:w="2400"/>
@@ -2778,26 +3267,6 @@
                 <w:sz w:val="14"/>
               </w:rPr>
               <w:t>—</w:t>
-            </w:r>
-          </w:p>
-        </w:tc>
-      </w:tr>
-      <w:tr>
-        <w:tc>
-          <w:tcPr>
-            <w:tcW w:type="dxa" w:w="2400"/>
-            <w:shd w:fill="EAF2F8"/>
-            <w:vAlign w:val="center"/>
-          </w:tcPr>
-          <w:p>
-            <w:pPr>
-              <w:jc w:val="left"/>
-            </w:pPr>
-            <w:r>
-              <w:rPr>
-                <w:sz w:val="14"/>
-              </w:rPr>
-              <w:t>Dementia</w:t>
             </w:r>
           </w:p>
         </w:tc>
@@ -2852,6 +3321,26 @@
             </w:r>
           </w:p>
         </w:tc>
+      </w:tr>
+      <w:tr>
+        <w:tc>
+          <w:tcPr>
+            <w:tcW w:type="dxa" w:w="2400"/>
+            <w:shd w:fill="EAF2F8"/>
+            <w:vAlign w:val="center"/>
+          </w:tcPr>
+          <w:p>
+            <w:pPr>
+              <w:jc w:val="left"/>
+            </w:pPr>
+            <w:r>
+              <w:rPr>
+                <w:sz w:val="14"/>
+              </w:rPr>
+              <w:t>ACA</w:t>
+            </w:r>
+          </w:p>
+        </w:tc>
         <w:tc>
           <w:tcPr>
             <w:tcW w:type="dxa" w:w="2400"/>
@@ -2883,26 +3372,6 @@
                 <w:sz w:val="14"/>
               </w:rPr>
               <w:t>—</w:t>
-            </w:r>
-          </w:p>
-        </w:tc>
-      </w:tr>
-      <w:tr>
-        <w:tc>
-          <w:tcPr>
-            <w:tcW w:type="dxa" w:w="2400"/>
-            <w:shd w:fill="EAF2F8"/>
-            <w:vAlign w:val="center"/>
-          </w:tcPr>
-          <w:p>
-            <w:pPr>
-              <w:jc w:val="left"/>
-            </w:pPr>
-            <w:r>
-              <w:rPr>
-                <w:sz w:val="14"/>
-              </w:rPr>
-              <w:t>ACA</w:t>
             </w:r>
           </w:p>
         </w:tc>
@@ -2957,6 +3426,26 @@
             </w:r>
           </w:p>
         </w:tc>
+      </w:tr>
+      <w:tr>
+        <w:tc>
+          <w:tcPr>
+            <w:tcW w:type="dxa" w:w="2400"/>
+            <w:shd w:fill="EAF2F8"/>
+            <w:vAlign w:val="center"/>
+          </w:tcPr>
+          <w:p>
+            <w:pPr>
+              <w:jc w:val="left"/>
+            </w:pPr>
+            <w:r>
+              <w:rPr>
+                <w:sz w:val="14"/>
+              </w:rPr>
+              <w:t>Side_Right</w:t>
+            </w:r>
+          </w:p>
+        </w:tc>
         <w:tc>
           <w:tcPr>
             <w:tcW w:type="dxa" w:w="2400"/>
@@ -2988,26 +3477,6 @@
                 <w:sz w:val="14"/>
               </w:rPr>
               <w:t>—</w:t>
-            </w:r>
-          </w:p>
-        </w:tc>
-      </w:tr>
-      <w:tr>
-        <w:tc>
-          <w:tcPr>
-            <w:tcW w:type="dxa" w:w="2400"/>
-            <w:shd w:fill="EAF2F8"/>
-            <w:vAlign w:val="center"/>
-          </w:tcPr>
-          <w:p>
-            <w:pPr>
-              <w:jc w:val="left"/>
-            </w:pPr>
-            <w:r>
-              <w:rPr>
-                <w:sz w:val="14"/>
-              </w:rPr>
-              <w:t>Side_Right</w:t>
             </w:r>
           </w:p>
         </w:tc>
@@ -3062,6 +3531,26 @@
             </w:r>
           </w:p>
         </w:tc>
+      </w:tr>
+      <w:tr>
+        <w:tc>
+          <w:tcPr>
+            <w:tcW w:type="dxa" w:w="2400"/>
+            <w:shd w:fill="EAF2F8"/>
+            <w:vAlign w:val="center"/>
+          </w:tcPr>
+          <w:p>
+            <w:pPr>
+              <w:jc w:val="left"/>
+            </w:pPr>
+            <w:r>
+              <w:rPr>
+                <w:sz w:val="14"/>
+              </w:rPr>
+              <w:t>Undetermined</w:t>
+            </w:r>
+          </w:p>
+        </w:tc>
         <w:tc>
           <w:tcPr>
             <w:tcW w:type="dxa" w:w="2400"/>
@@ -3093,26 +3582,6 @@
                 <w:sz w:val="14"/>
               </w:rPr>
               <w:t>—</w:t>
-            </w:r>
-          </w:p>
-        </w:tc>
-      </w:tr>
-      <w:tr>
-        <w:tc>
-          <w:tcPr>
-            <w:tcW w:type="dxa" w:w="2400"/>
-            <w:shd w:fill="EAF2F8"/>
-            <w:vAlign w:val="center"/>
-          </w:tcPr>
-          <w:p>
-            <w:pPr>
-              <w:jc w:val="left"/>
-            </w:pPr>
-            <w:r>
-              <w:rPr>
-                <w:sz w:val="14"/>
-              </w:rPr>
-              <w:t>Undetermined</w:t>
             </w:r>
           </w:p>
         </w:tc>
@@ -3167,6 +3636,26 @@
             </w:r>
           </w:p>
         </w:tc>
+      </w:tr>
+      <w:tr>
+        <w:tc>
+          <w:tcPr>
+            <w:tcW w:type="dxa" w:w="2400"/>
+            <w:shd w:fill="EAF2F8"/>
+            <w:vAlign w:val="center"/>
+          </w:tcPr>
+          <w:p>
+            <w:pPr>
+              <w:jc w:val="left"/>
+            </w:pPr>
+            <w:r>
+              <w:rPr>
+                <w:sz w:val="14"/>
+              </w:rPr>
+              <w:t>CAD</w:t>
+            </w:r>
+          </w:p>
+        </w:tc>
         <w:tc>
           <w:tcPr>
             <w:tcW w:type="dxa" w:w="2400"/>
@@ -3198,26 +3687,6 @@
                 <w:sz w:val="14"/>
               </w:rPr>
               <w:t>—</w:t>
-            </w:r>
-          </w:p>
-        </w:tc>
-      </w:tr>
-      <w:tr>
-        <w:tc>
-          <w:tcPr>
-            <w:tcW w:type="dxa" w:w="2400"/>
-            <w:shd w:fill="EAF2F8"/>
-            <w:vAlign w:val="center"/>
-          </w:tcPr>
-          <w:p>
-            <w:pPr>
-              <w:jc w:val="left"/>
-            </w:pPr>
-            <w:r>
-              <w:rPr>
-                <w:sz w:val="14"/>
-              </w:rPr>
-              <w:t>CAD</w:t>
             </w:r>
           </w:p>
         </w:tc>
@@ -3272,6 +3741,26 @@
             </w:r>
           </w:p>
         </w:tc>
+      </w:tr>
+      <w:tr>
+        <w:tc>
+          <w:tcPr>
+            <w:tcW w:type="dxa" w:w="2400"/>
+            <w:shd w:fill="EAF2F8"/>
+            <w:vAlign w:val="center"/>
+          </w:tcPr>
+          <w:p>
+            <w:pPr>
+              <w:jc w:val="left"/>
+            </w:pPr>
+            <w:r>
+              <w:rPr>
+                <w:sz w:val="14"/>
+              </w:rPr>
+              <w:t>Cellulitis</w:t>
+            </w:r>
+          </w:p>
+        </w:tc>
         <w:tc>
           <w:tcPr>
             <w:tcW w:type="dxa" w:w="2400"/>
@@ -3303,26 +3792,6 @@
                 <w:sz w:val="14"/>
               </w:rPr>
               <w:t>—</w:t>
-            </w:r>
-          </w:p>
-        </w:tc>
-      </w:tr>
-      <w:tr>
-        <w:tc>
-          <w:tcPr>
-            <w:tcW w:type="dxa" w:w="2400"/>
-            <w:shd w:fill="EAF2F8"/>
-            <w:vAlign w:val="center"/>
-          </w:tcPr>
-          <w:p>
-            <w:pPr>
-              <w:jc w:val="left"/>
-            </w:pPr>
-            <w:r>
-              <w:rPr>
-                <w:sz w:val="14"/>
-              </w:rPr>
-              <w:t>Cellulitis</w:t>
             </w:r>
           </w:p>
         </w:tc>
@@ -3377,6 +3846,26 @@
             </w:r>
           </w:p>
         </w:tc>
+      </w:tr>
+      <w:tr>
+        <w:tc>
+          <w:tcPr>
+            <w:tcW w:type="dxa" w:w="2400"/>
+            <w:shd w:fill="EAF2F8"/>
+            <w:vAlign w:val="center"/>
+          </w:tcPr>
+          <w:p>
+            <w:pPr>
+              <w:jc w:val="left"/>
+            </w:pPr>
+            <w:r>
+              <w:rPr>
+                <w:sz w:val="14"/>
+              </w:rPr>
+              <w:t>LVS</w:t>
+            </w:r>
+          </w:p>
+        </w:tc>
         <w:tc>
           <w:tcPr>
             <w:tcW w:type="dxa" w:w="2400"/>
@@ -3408,26 +3897,6 @@
                 <w:sz w:val="14"/>
               </w:rPr>
               <w:t>—</w:t>
-            </w:r>
-          </w:p>
-        </w:tc>
-      </w:tr>
-      <w:tr>
-        <w:tc>
-          <w:tcPr>
-            <w:tcW w:type="dxa" w:w="2400"/>
-            <w:shd w:fill="EAF2F8"/>
-            <w:vAlign w:val="center"/>
-          </w:tcPr>
-          <w:p>
-            <w:pPr>
-              <w:jc w:val="left"/>
-            </w:pPr>
-            <w:r>
-              <w:rPr>
-                <w:sz w:val="14"/>
-              </w:rPr>
-              <w:t>LVS</w:t>
             </w:r>
           </w:p>
         </w:tc>
@@ -3479,40 +3948,6 @@
                 <w:sz w:val="14"/>
               </w:rPr>
               <w:t>4.8; 80%</w:t>
-            </w:r>
-          </w:p>
-        </w:tc>
-        <w:tc>
-          <w:tcPr>
-            <w:tcW w:type="dxa" w:w="2400"/>
-            <w:vAlign w:val="center"/>
-          </w:tcPr>
-          <w:p>
-            <w:pPr>
-              <w:jc w:val="center"/>
-            </w:pPr>
-            <w:r>
-              <w:rPr>
-                <w:sz w:val="14"/>
-              </w:rPr>
-              <w:t>—</w:t>
-            </w:r>
-          </w:p>
-        </w:tc>
-        <w:tc>
-          <w:tcPr>
-            <w:tcW w:type="dxa" w:w="2400"/>
-            <w:vAlign w:val="center"/>
-          </w:tcPr>
-          <w:p>
-            <w:pPr>
-              <w:jc w:val="center"/>
-            </w:pPr>
-            <w:r>
-              <w:rPr>
-                <w:sz w:val="14"/>
-              </w:rPr>
-              <w:t>—</w:t>
             </w:r>
           </w:p>
         </w:tc>

</xml_diff>

<commit_message>
Finalize publication revision outputs
Co-authored-by: dreamcheap2000 <229635625+dreamcheap2000@users.noreply.github.com>
</commit_message>
<xml_diff>
--- a/20260912_Tables_1840.docx
+++ b/20260912_Tables_1840.docx
@@ -557,7 +557,7 @@
               <w:rPr>
                 <w:sz w:val="14"/>
               </w:rPr>
-              <w:t>1.2</w:t>
+              <w:t>0.2</w:t>
             </w:r>
           </w:p>
         </w:tc>
@@ -798,7 +798,7 @@
               <w:rPr>
                 <w:sz w:val="14"/>
               </w:rPr>
-              <w:t>9.3</w:t>
+              <w:t>0.5</w:t>
             </w:r>
           </w:p>
         </w:tc>
@@ -1039,7 +1039,7 @@
               <w:rPr>
                 <w:sz w:val="14"/>
               </w:rPr>
-              <w:t>10.2</w:t>
+              <w:t>-0.9</w:t>
             </w:r>
           </w:p>
         </w:tc>
@@ -1280,7 +1280,7 @@
               <w:rPr>
                 <w:sz w:val="14"/>
               </w:rPr>
-              <w:t>21.0</w:t>
+              <w:t>1.1</w:t>
             </w:r>
           </w:p>
         </w:tc>
@@ -1521,7 +1521,7 @@
               <w:rPr>
                 <w:sz w:val="14"/>
               </w:rPr>
-              <w:t>26.5</w:t>
+              <w:t>1.6</w:t>
             </w:r>
           </w:p>
         </w:tc>

</xml_diff>

<commit_message>
Align calibration reporting with stored OOF predictions
Co-authored-by: dreamcheap2000 <229635625+dreamcheap2000@users.noreply.github.com>
</commit_message>
<xml_diff>
--- a/20260912_Tables_1840.docx
+++ b/20260912_Tables_1840.docx
@@ -56,7 +56,7 @@
         <w:rPr>
           <w:sz w:val="16"/>
         </w:rPr>
-        <w:t>Rows are intentionally ordered by clinical parsimony. Calibration metrics are from weighted out-of-fold predictions among completers; balanced accuracy is still shown for the Best and Worst non-completer walking scenarios.</w:t>
+        <w:t>Rows are intentionally ordered by clinical parsimony. Calibration metrics are derived from the original Part 1 out-of-fold 6MWT4 predictions, while balanced accuracy is still shown for the Best and Worst non-completer walking scenarios.</w:t>
       </w:r>
     </w:p>
     <w:tbl>
@@ -557,7 +557,7 @@
               <w:rPr>
                 <w:sz w:val="14"/>
               </w:rPr>
-              <w:t>0.2</w:t>
+              <w:t>0.0</w:t>
             </w:r>
           </w:p>
         </w:tc>
@@ -574,7 +574,7 @@
               <w:rPr>
                 <w:sz w:val="14"/>
               </w:rPr>
-              <w:t>0.997</w:t>
+              <w:t>1.000</w:t>
             </w:r>
           </w:p>
         </w:tc>
@@ -798,7 +798,7 @@
               <w:rPr>
                 <w:sz w:val="14"/>
               </w:rPr>
-              <w:t>0.5</w:t>
+              <w:t>0.0</w:t>
             </w:r>
           </w:p>
         </w:tc>
@@ -815,7 +815,7 @@
               <w:rPr>
                 <w:sz w:val="14"/>
               </w:rPr>
-              <w:t>0.972</w:t>
+              <w:t>1.025</w:t>
             </w:r>
           </w:p>
         </w:tc>
@@ -1039,7 +1039,7 @@
               <w:rPr>
                 <w:sz w:val="14"/>
               </w:rPr>
-              <w:t>-0.9</w:t>
+              <w:t>0.0</w:t>
             </w:r>
           </w:p>
         </w:tc>
@@ -1056,7 +1056,7 @@
               <w:rPr>
                 <w:sz w:val="14"/>
               </w:rPr>
-              <w:t>0.965</w:t>
+              <w:t>1.019</w:t>
             </w:r>
           </w:p>
         </w:tc>
@@ -1280,7 +1280,7 @@
               <w:rPr>
                 <w:sz w:val="14"/>
               </w:rPr>
-              <w:t>1.1</w:t>
+              <w:t>0.0</w:t>
             </w:r>
           </w:p>
         </w:tc>
@@ -1297,7 +1297,7 @@
               <w:rPr>
                 <w:sz w:val="14"/>
               </w:rPr>
-              <w:t>0.937</w:t>
+              <w:t>1.052</w:t>
             </w:r>
           </w:p>
         </w:tc>
@@ -1521,7 +1521,7 @@
               <w:rPr>
                 <w:sz w:val="14"/>
               </w:rPr>
-              <w:t>1.6</w:t>
+              <w:t>0.0</w:t>
             </w:r>
           </w:p>
         </w:tc>
@@ -1538,7 +1538,7 @@
               <w:rPr>
                 <w:sz w:val="14"/>
               </w:rPr>
-              <w:t>0.921</w:t>
+              <w:t>1.087</w:t>
             </w:r>
           </w:p>
         </w:tc>

</xml_diff>